<commit_message>
TS 5.6 kramam corr files
</commit_message>
<xml_diff>
--- a/TS-Kramam/TS-5.6/TS 5.6 Sanskrit Krama Paatam Corrections.docx
+++ b/TS-Kramam/TS-5.6/TS 5.6 Sanskrit Krama Paatam Corrections.docx
@@ -188,12 +188,16 @@
               <w:spacing w:before="0" w:line="240" w:lineRule="auto"/>
               <w:jc w:val="center"/>
               <w:rPr>
-                <w:sz w:val="32"/>
-                <w:szCs w:val="32"/>
-              </w:rPr>
-            </w:pPr>
-            <w:r>
-              <w:rPr>
+                <w:b/>
+                <w:bCs/>
+                <w:sz w:val="32"/>
+                <w:szCs w:val="32"/>
+              </w:rPr>
+            </w:pPr>
+            <w:r>
+              <w:rPr>
+                <w:b/>
+                <w:bCs/>
                 <w:sz w:val="32"/>
                 <w:szCs w:val="32"/>
               </w:rPr>
@@ -205,12 +209,16 @@
               <w:spacing w:before="0" w:line="240" w:lineRule="auto"/>
               <w:jc w:val="center"/>
               <w:rPr>
-                <w:sz w:val="32"/>
-                <w:szCs w:val="32"/>
-              </w:rPr>
-            </w:pPr>
-            <w:r>
-              <w:rPr>
+                <w:b/>
+                <w:bCs/>
+                <w:sz w:val="32"/>
+                <w:szCs w:val="32"/>
+              </w:rPr>
+            </w:pPr>
+            <w:r>
+              <w:rPr>
+                <w:b/>
+                <w:bCs/>
                 <w:sz w:val="32"/>
                 <w:szCs w:val="32"/>
               </w:rPr>
@@ -227,12 +235,16 @@
               <w:spacing w:before="0" w:line="240" w:lineRule="auto"/>
               <w:jc w:val="center"/>
               <w:rPr>
-                <w:sz w:val="32"/>
-                <w:szCs w:val="32"/>
-              </w:rPr>
-            </w:pPr>
-            <w:r>
-              <w:rPr>
+                <w:b/>
+                <w:bCs/>
+                <w:sz w:val="32"/>
+                <w:szCs w:val="32"/>
+              </w:rPr>
+            </w:pPr>
+            <w:r>
+              <w:rPr>
+                <w:b/>
+                <w:bCs/>
                 <w:sz w:val="32"/>
                 <w:szCs w:val="32"/>
               </w:rPr>
@@ -250,12 +262,16 @@
               <w:ind w:right="-18"/>
               <w:jc w:val="center"/>
               <w:rPr>
-                <w:sz w:val="32"/>
-                <w:szCs w:val="32"/>
-              </w:rPr>
-            </w:pPr>
-            <w:r>
-              <w:rPr>
+                <w:b/>
+                <w:bCs/>
+                <w:sz w:val="32"/>
+                <w:szCs w:val="32"/>
+              </w:rPr>
+            </w:pPr>
+            <w:r>
+              <w:rPr>
+                <w:b/>
+                <w:bCs/>
                 <w:sz w:val="32"/>
                 <w:szCs w:val="32"/>
               </w:rPr>
@@ -467,7 +483,29 @@
                 <w:szCs w:val="40"/>
                 <w:lang w:bidi="ml-IN"/>
               </w:rPr>
-              <w:t>Wû lÉþÈ | lÉ</w:t>
+              <w:t xml:space="preserve">Wû </w:t>
+            </w:r>
+            <w:proofErr w:type="spellStart"/>
+            <w:r>
+              <w:rPr>
+                <w:rFonts w:ascii="BRH Devanagari Extra" w:hAnsi="BRH Devanagari Extra" w:cs="BRH Devanagari Extra"/>
+                <w:color w:val="000000"/>
+                <w:sz w:val="40"/>
+                <w:szCs w:val="40"/>
+                <w:lang w:bidi="ml-IN"/>
+              </w:rPr>
+              <w:t>lÉþÈ</w:t>
+            </w:r>
+            <w:proofErr w:type="spellEnd"/>
+            <w:r>
+              <w:rPr>
+                <w:rFonts w:ascii="BRH Devanagari Extra" w:hAnsi="BRH Devanagari Extra" w:cs="BRH Devanagari Extra"/>
+                <w:color w:val="000000"/>
+                <w:sz w:val="40"/>
+                <w:szCs w:val="40"/>
+                <w:lang w:bidi="ml-IN"/>
+              </w:rPr>
+              <w:t xml:space="preserve"> | lÉ</w:t>
             </w:r>
             <w:r>
               <w:rPr>
@@ -488,7 +526,18 @@
                 <w:szCs w:val="40"/>
                 <w:lang w:bidi="ml-IN"/>
               </w:rPr>
-              <w:t xml:space="preserve"> C</w:t>
+              <w:t xml:space="preserve"> </w:t>
+            </w:r>
+            <w:proofErr w:type="spellStart"/>
+            <w:r>
+              <w:rPr>
+                <w:rFonts w:ascii="BRH Devanagari Extra" w:hAnsi="BRH Devanagari Extra" w:cs="BRH Devanagari Extra"/>
+                <w:color w:val="000000"/>
+                <w:sz w:val="40"/>
+                <w:szCs w:val="40"/>
+                <w:lang w:bidi="ml-IN"/>
+              </w:rPr>
+              <w:t>C</w:t>
             </w:r>
             <w:r>
               <w:rPr>
@@ -499,8 +548,33 @@
                 <w:highlight w:val="yellow"/>
                 <w:lang w:bidi="ml-IN"/>
               </w:rPr>
-              <w:t>ÌiÉ lÉþÈ</w:t>
-            </w:r>
+              <w:t>ÌiÉ</w:t>
+            </w:r>
+            <w:proofErr w:type="spellEnd"/>
+            <w:r>
+              <w:rPr>
+                <w:rFonts w:ascii="BRH Devanagari Extra" w:hAnsi="BRH Devanagari Extra" w:cs="BRH Devanagari Extra"/>
+                <w:color w:val="000000"/>
+                <w:sz w:val="40"/>
+                <w:szCs w:val="40"/>
+                <w:highlight w:val="yellow"/>
+                <w:lang w:bidi="ml-IN"/>
+              </w:rPr>
+              <w:t xml:space="preserve"> </w:t>
+            </w:r>
+            <w:proofErr w:type="spellStart"/>
+            <w:r>
+              <w:rPr>
+                <w:rFonts w:ascii="BRH Devanagari Extra" w:hAnsi="BRH Devanagari Extra" w:cs="BRH Devanagari Extra"/>
+                <w:color w:val="000000"/>
+                <w:sz w:val="40"/>
+                <w:szCs w:val="40"/>
+                <w:highlight w:val="yellow"/>
+                <w:lang w:bidi="ml-IN"/>
+              </w:rPr>
+              <w:t>lÉþÈ</w:t>
+            </w:r>
+            <w:proofErr w:type="spellEnd"/>
             <w:r>
               <w:rPr>
                 <w:rFonts w:ascii="BRH Devanagari Extra" w:hAnsi="BRH Devanagari Extra" w:cs="BRH Devanagari Extra"/>
@@ -561,7 +635,29 @@
                 <w:szCs w:val="40"/>
                 <w:lang w:bidi="ml-IN"/>
               </w:rPr>
-              <w:t>Wû lÉþÈ | lÉ</w:t>
+              <w:t xml:space="preserve">Wû </w:t>
+            </w:r>
+            <w:proofErr w:type="spellStart"/>
+            <w:r>
+              <w:rPr>
+                <w:rFonts w:ascii="BRH Devanagari Extra" w:hAnsi="BRH Devanagari Extra" w:cs="BRH Devanagari Extra"/>
+                <w:color w:val="000000"/>
+                <w:sz w:val="40"/>
+                <w:szCs w:val="40"/>
+                <w:lang w:bidi="ml-IN"/>
+              </w:rPr>
+              <w:t>lÉþÈ</w:t>
+            </w:r>
+            <w:proofErr w:type="spellEnd"/>
+            <w:r>
+              <w:rPr>
+                <w:rFonts w:ascii="BRH Devanagari Extra" w:hAnsi="BRH Devanagari Extra" w:cs="BRH Devanagari Extra"/>
+                <w:color w:val="000000"/>
+                <w:sz w:val="40"/>
+                <w:szCs w:val="40"/>
+                <w:lang w:bidi="ml-IN"/>
+              </w:rPr>
+              <w:t xml:space="preserve"> | lÉ</w:t>
             </w:r>
             <w:r>
               <w:rPr>
@@ -582,7 +678,18 @@
                 <w:szCs w:val="40"/>
                 <w:lang w:bidi="ml-IN"/>
               </w:rPr>
-              <w:t xml:space="preserve"> C</w:t>
+              <w:t xml:space="preserve"> </w:t>
+            </w:r>
+            <w:proofErr w:type="spellStart"/>
+            <w:r>
+              <w:rPr>
+                <w:rFonts w:ascii="BRH Devanagari Extra" w:hAnsi="BRH Devanagari Extra" w:cs="BRH Devanagari Extra"/>
+                <w:color w:val="000000"/>
+                <w:sz w:val="40"/>
+                <w:szCs w:val="40"/>
+                <w:lang w:bidi="ml-IN"/>
+              </w:rPr>
+              <w:t>C</w:t>
             </w:r>
             <w:r>
               <w:rPr>
@@ -593,17 +700,52 @@
                 <w:highlight w:val="green"/>
                 <w:lang w:bidi="ml-IN"/>
               </w:rPr>
-              <w:t>ÌiÉþ lÉ</w:t>
-            </w:r>
-            <w:r>
-              <w:rPr>
-                <w:rFonts w:ascii="BRH Devanagari Extra" w:hAnsi="BRH Devanagari Extra" w:cs="BRH Devanagari Extra"/>
-                <w:color w:val="000000"/>
-                <w:sz w:val="40"/>
-                <w:szCs w:val="40"/>
-                <w:lang w:bidi="ml-IN"/>
-              </w:rPr>
-              <w:t>È ||</w:t>
+              <w:t>ÌiÉþ</w:t>
+            </w:r>
+            <w:proofErr w:type="spellEnd"/>
+            <w:r>
+              <w:rPr>
+                <w:rFonts w:ascii="BRH Devanagari Extra" w:hAnsi="BRH Devanagari Extra" w:cs="BRH Devanagari Extra"/>
+                <w:color w:val="000000"/>
+                <w:sz w:val="40"/>
+                <w:szCs w:val="40"/>
+                <w:highlight w:val="green"/>
+                <w:lang w:bidi="ml-IN"/>
+              </w:rPr>
+              <w:t xml:space="preserve"> </w:t>
+            </w:r>
+            <w:proofErr w:type="spellStart"/>
+            <w:r>
+              <w:rPr>
+                <w:rFonts w:ascii="BRH Devanagari Extra" w:hAnsi="BRH Devanagari Extra" w:cs="BRH Devanagari Extra"/>
+                <w:color w:val="000000"/>
+                <w:sz w:val="40"/>
+                <w:szCs w:val="40"/>
+                <w:highlight w:val="green"/>
+                <w:lang w:bidi="ml-IN"/>
+              </w:rPr>
+              <w:t>lÉ</w:t>
+            </w:r>
+            <w:r>
+              <w:rPr>
+                <w:rFonts w:ascii="BRH Devanagari Extra" w:hAnsi="BRH Devanagari Extra" w:cs="BRH Devanagari Extra"/>
+                <w:color w:val="000000"/>
+                <w:sz w:val="40"/>
+                <w:szCs w:val="40"/>
+                <w:lang w:bidi="ml-IN"/>
+              </w:rPr>
+              <w:t>È</w:t>
+            </w:r>
+            <w:proofErr w:type="spellEnd"/>
+            <w:r>
+              <w:rPr>
+                <w:rFonts w:ascii="BRH Devanagari Extra" w:hAnsi="BRH Devanagari Extra" w:cs="BRH Devanagari Extra"/>
+                <w:color w:val="000000"/>
+                <w:sz w:val="40"/>
+                <w:szCs w:val="40"/>
+                <w:lang w:bidi="ml-IN"/>
+              </w:rPr>
+              <w:t xml:space="preserve"> ||</w:t>
             </w:r>
           </w:p>
         </w:tc>
@@ -791,15 +933,27 @@
               </w:rPr>
               <w:t>–</w:t>
             </w:r>
-            <w:r>
-              <w:rPr>
-                <w:rFonts w:ascii="BRH Devanagari Extra" w:hAnsi="BRH Devanagari Extra" w:cs="BRH Devanagari Extra"/>
-                <w:color w:val="000000"/>
-                <w:sz w:val="40"/>
-                <w:szCs w:val="40"/>
-                <w:lang w:bidi="ml-IN"/>
-              </w:rPr>
-              <w:t xml:space="preserve">ÍpÉ | </w:t>
+            <w:proofErr w:type="spellStart"/>
+            <w:r>
+              <w:rPr>
+                <w:rFonts w:ascii="BRH Devanagari Extra" w:hAnsi="BRH Devanagari Extra" w:cs="BRH Devanagari Extra"/>
+                <w:color w:val="000000"/>
+                <w:sz w:val="40"/>
+                <w:szCs w:val="40"/>
+                <w:lang w:bidi="ml-IN"/>
+              </w:rPr>
+              <w:t>ÍpÉ</w:t>
+            </w:r>
+            <w:proofErr w:type="spellEnd"/>
+            <w:r>
+              <w:rPr>
+                <w:rFonts w:ascii="BRH Devanagari Extra" w:hAnsi="BRH Devanagari Extra" w:cs="BRH Devanagari Extra"/>
+                <w:color w:val="000000"/>
+                <w:sz w:val="40"/>
+                <w:szCs w:val="40"/>
+                <w:lang w:bidi="ml-IN"/>
+              </w:rPr>
+              <w:t xml:space="preserve"> | </w:t>
             </w:r>
           </w:p>
           <w:p>
@@ -902,6 +1056,7 @@
               </w:rPr>
               <w:t>–</w:t>
             </w:r>
+            <w:proofErr w:type="spellStart"/>
             <w:r>
               <w:rPr>
                 <w:rFonts w:ascii="BRH Devanagari Extra" w:hAnsi="BRH Devanagari Extra" w:cs="BRH Devanagari Extra"/>
@@ -912,6 +1067,7 @@
               </w:rPr>
               <w:t>xrÉ</w:t>
             </w:r>
+            <w:proofErr w:type="spellEnd"/>
             <w:r>
               <w:rPr>
                 <w:rFonts w:ascii="BRH Malayalam Extra" w:hAnsi="BRH Malayalam Extra" w:cs="BRH Devanagari Extra"/>
@@ -2065,6 +2221,7 @@
                 <w:lang w:val="en-IN" w:eastAsia="en-IN" w:bidi="ml-IN"/>
               </w:rPr>
             </w:pPr>
+            <w:proofErr w:type="spellStart"/>
             <w:r>
               <w:rPr>
                 <w:rFonts w:ascii="BRH Devanagari Extra" w:hAnsi="BRH Devanagari Extra" w:cs="BRH Devanagari Extra"/>
@@ -2075,6 +2232,7 @@
               </w:rPr>
               <w:t>pÉuÉ</w:t>
             </w:r>
+            <w:proofErr w:type="spellEnd"/>
             <w:r>
               <w:rPr>
                 <w:rFonts w:ascii="BRH Malayalam Extra" w:hAnsi="BRH Malayalam Extra" w:cs="BRH Devanagari Extra"/>
@@ -2087,6 +2245,7 @@
               </w:rPr>
               <w:t>–</w:t>
             </w:r>
+            <w:proofErr w:type="spellStart"/>
             <w:r>
               <w:rPr>
                 <w:rFonts w:ascii="BRH Devanagari Extra" w:hAnsi="BRH Devanagari Extra" w:cs="BRH Devanagari Extra"/>
@@ -2108,6 +2267,7 @@
               </w:rPr>
               <w:t>ÌiÉ</w:t>
             </w:r>
+            <w:proofErr w:type="spellEnd"/>
             <w:r>
               <w:rPr>
                 <w:rFonts w:ascii="BRH Malayalam Extra" w:hAnsi="BRH Malayalam Extra" w:cs="BRH Devanagari Extra"/>
@@ -2127,7 +2287,29 @@
                 <w:szCs w:val="40"/>
                 <w:lang w:bidi="ml-IN"/>
               </w:rPr>
-              <w:t xml:space="preserve"> pÉuÉþÎliÉ ||</w:t>
+              <w:t xml:space="preserve"> </w:t>
+            </w:r>
+            <w:proofErr w:type="spellStart"/>
+            <w:r>
+              <w:rPr>
+                <w:rFonts w:ascii="BRH Devanagari Extra" w:hAnsi="BRH Devanagari Extra" w:cs="BRH Devanagari Extra"/>
+                <w:color w:val="000000"/>
+                <w:sz w:val="40"/>
+                <w:szCs w:val="40"/>
+                <w:lang w:bidi="ml-IN"/>
+              </w:rPr>
+              <w:t>pÉuÉþÎliÉ</w:t>
+            </w:r>
+            <w:proofErr w:type="spellEnd"/>
+            <w:r>
+              <w:rPr>
+                <w:rFonts w:ascii="BRH Devanagari Extra" w:hAnsi="BRH Devanagari Extra" w:cs="BRH Devanagari Extra"/>
+                <w:color w:val="000000"/>
+                <w:sz w:val="40"/>
+                <w:szCs w:val="40"/>
+                <w:lang w:bidi="ml-IN"/>
+              </w:rPr>
+              <w:t xml:space="preserve"> ||</w:t>
             </w:r>
           </w:p>
         </w:tc>
@@ -2150,6 +2332,7 @@
                 <w:lang w:val="en-IN" w:eastAsia="en-IN" w:bidi="ml-IN"/>
               </w:rPr>
             </w:pPr>
+            <w:proofErr w:type="spellStart"/>
             <w:r>
               <w:rPr>
                 <w:rFonts w:ascii="BRH Devanagari Extra" w:hAnsi="BRH Devanagari Extra" w:cs="BRH Devanagari Extra"/>
@@ -2160,6 +2343,7 @@
               </w:rPr>
               <w:t>pÉuÉ</w:t>
             </w:r>
+            <w:proofErr w:type="spellEnd"/>
             <w:r>
               <w:rPr>
                 <w:rFonts w:ascii="BRH Malayalam Extra" w:hAnsi="BRH Malayalam Extra" w:cs="BRH Devanagari Extra"/>
@@ -2171,6 +2355,7 @@
               </w:rPr>
               <w:t>–</w:t>
             </w:r>
+            <w:proofErr w:type="spellStart"/>
             <w:r>
               <w:rPr>
                 <w:rFonts w:ascii="BRH Devanagari Extra" w:hAnsi="BRH Devanagari Extra" w:cs="BRH Devanagari Extra"/>
@@ -2192,6 +2377,7 @@
               </w:rPr>
               <w:t>ÌiÉ</w:t>
             </w:r>
+            <w:proofErr w:type="spellEnd"/>
             <w:r>
               <w:rPr>
                 <w:rFonts w:ascii="BRH Malayalam Extra" w:hAnsi="BRH Malayalam Extra" w:cs="BRH Devanagari Extra"/>
@@ -2211,7 +2397,29 @@
                 <w:szCs w:val="40"/>
                 <w:lang w:bidi="ml-IN"/>
               </w:rPr>
-              <w:t xml:space="preserve"> pÉuÉþÎliÉ ||</w:t>
+              <w:t xml:space="preserve"> </w:t>
+            </w:r>
+            <w:proofErr w:type="spellStart"/>
+            <w:r>
+              <w:rPr>
+                <w:rFonts w:ascii="BRH Devanagari Extra" w:hAnsi="BRH Devanagari Extra" w:cs="BRH Devanagari Extra"/>
+                <w:color w:val="000000"/>
+                <w:sz w:val="40"/>
+                <w:szCs w:val="40"/>
+                <w:lang w:bidi="ml-IN"/>
+              </w:rPr>
+              <w:t>pÉuÉþÎliÉ</w:t>
+            </w:r>
+            <w:proofErr w:type="spellEnd"/>
+            <w:r>
+              <w:rPr>
+                <w:rFonts w:ascii="BRH Devanagari Extra" w:hAnsi="BRH Devanagari Extra" w:cs="BRH Devanagari Extra"/>
+                <w:color w:val="000000"/>
+                <w:sz w:val="40"/>
+                <w:szCs w:val="40"/>
+                <w:lang w:bidi="ml-IN"/>
+              </w:rPr>
+              <w:t xml:space="preserve"> ||</w:t>
             </w:r>
           </w:p>
         </w:tc>
@@ -2366,6 +2574,7 @@
               </w:rPr>
               <w:t>–</w:t>
             </w:r>
+            <w:proofErr w:type="spellStart"/>
             <w:r>
               <w:rPr>
                 <w:rFonts w:ascii="BRH Devanagari Extra" w:hAnsi="BRH Devanagari Extra" w:cs="BRH Devanagari Extra"/>
@@ -2387,6 +2596,7 @@
               </w:rPr>
               <w:t>xiÉ</w:t>
             </w:r>
+            <w:proofErr w:type="spellEnd"/>
             <w:r>
               <w:rPr>
                 <w:rFonts w:ascii="BRH Malayalam Extra" w:hAnsi="BRH Malayalam Extra" w:cs="BRH Devanagari Extra"/>
@@ -2399,16 +2609,40 @@
               </w:rPr>
               <w:t>–</w:t>
             </w:r>
-            <w:r>
-              <w:rPr>
-                <w:rFonts w:ascii="BRH Devanagari Extra" w:hAnsi="BRH Devanagari Extra" w:cs="BRH Devanagari Extra"/>
-                <w:color w:val="000000"/>
-                <w:sz w:val="40"/>
-                <w:szCs w:val="40"/>
-                <w:lang w:bidi="ml-IN"/>
-              </w:rPr>
-              <w:t>xqÉÉÿiÉç | iÉxqÉÉ</w:t>
-            </w:r>
+            <w:proofErr w:type="spellStart"/>
+            <w:r>
+              <w:rPr>
+                <w:rFonts w:ascii="BRH Devanagari Extra" w:hAnsi="BRH Devanagari Extra" w:cs="BRH Devanagari Extra"/>
+                <w:color w:val="000000"/>
+                <w:sz w:val="40"/>
+                <w:szCs w:val="40"/>
+                <w:lang w:bidi="ml-IN"/>
+              </w:rPr>
+              <w:t>xqÉÉÿiÉç</w:t>
+            </w:r>
+            <w:proofErr w:type="spellEnd"/>
+            <w:r>
+              <w:rPr>
+                <w:rFonts w:ascii="BRH Devanagari Extra" w:hAnsi="BRH Devanagari Extra" w:cs="BRH Devanagari Extra"/>
+                <w:color w:val="000000"/>
+                <w:sz w:val="40"/>
+                <w:szCs w:val="40"/>
+                <w:lang w:bidi="ml-IN"/>
+              </w:rPr>
+              <w:t xml:space="preserve"> | </w:t>
+            </w:r>
+            <w:proofErr w:type="spellStart"/>
+            <w:r>
+              <w:rPr>
+                <w:rFonts w:ascii="BRH Devanagari Extra" w:hAnsi="BRH Devanagari Extra" w:cs="BRH Devanagari Extra"/>
+                <w:color w:val="000000"/>
+                <w:sz w:val="40"/>
+                <w:szCs w:val="40"/>
+                <w:lang w:bidi="ml-IN"/>
+              </w:rPr>
+              <w:t>iÉxqÉÉ</w:t>
+            </w:r>
+            <w:proofErr w:type="spellEnd"/>
             <w:r>
               <w:rPr>
                 <w:rFonts w:ascii="BRH Malayalam Extra" w:hAnsi="BRH Malayalam Extra" w:cs="BRH Devanagari Extra"/>
@@ -2420,15 +2654,27 @@
               </w:rPr>
               <w:t>–</w:t>
             </w:r>
-            <w:r>
-              <w:rPr>
-                <w:rFonts w:ascii="BRH Devanagari Extra" w:hAnsi="BRH Devanagari Extra" w:cs="BRH Devanagari Extra"/>
-                <w:color w:val="000000"/>
-                <w:sz w:val="40"/>
-                <w:szCs w:val="40"/>
-                <w:lang w:bidi="ml-IN"/>
-              </w:rPr>
-              <w:t>SÉmÉþÈ |</w:t>
+            <w:proofErr w:type="spellStart"/>
+            <w:r>
+              <w:rPr>
+                <w:rFonts w:ascii="BRH Devanagari Extra" w:hAnsi="BRH Devanagari Extra" w:cs="BRH Devanagari Extra"/>
+                <w:color w:val="000000"/>
+                <w:sz w:val="40"/>
+                <w:szCs w:val="40"/>
+                <w:lang w:bidi="ml-IN"/>
+              </w:rPr>
+              <w:t>SÉmÉþÈ</w:t>
+            </w:r>
+            <w:proofErr w:type="spellEnd"/>
+            <w:r>
+              <w:rPr>
+                <w:rFonts w:ascii="BRH Devanagari Extra" w:hAnsi="BRH Devanagari Extra" w:cs="BRH Devanagari Extra"/>
+                <w:color w:val="000000"/>
+                <w:sz w:val="40"/>
+                <w:szCs w:val="40"/>
+                <w:lang w:bidi="ml-IN"/>
+              </w:rPr>
+              <w:t xml:space="preserve"> |</w:t>
             </w:r>
           </w:p>
         </w:tc>
@@ -2472,6 +2718,7 @@
               </w:rPr>
               <w:t>–</w:t>
             </w:r>
+            <w:proofErr w:type="spellStart"/>
             <w:r>
               <w:rPr>
                 <w:rFonts w:ascii="BRH Devanagari Extra" w:hAnsi="BRH Devanagari Extra" w:cs="BRH Devanagari Extra"/>
@@ -2501,8 +2748,31 @@
                 <w:szCs w:val="40"/>
                 <w:lang w:bidi="ml-IN"/>
               </w:rPr>
-              <w:t>xqÉÉÿiÉç | iÉxqÉÉ</w:t>
-            </w:r>
+              <w:t>xqÉÉÿiÉç</w:t>
+            </w:r>
+            <w:proofErr w:type="spellEnd"/>
+            <w:r>
+              <w:rPr>
+                <w:rFonts w:ascii="BRH Devanagari Extra" w:hAnsi="BRH Devanagari Extra" w:cs="BRH Devanagari Extra"/>
+                <w:color w:val="000000"/>
+                <w:sz w:val="40"/>
+                <w:szCs w:val="40"/>
+                <w:lang w:bidi="ml-IN"/>
+              </w:rPr>
+              <w:t xml:space="preserve"> | </w:t>
+            </w:r>
+            <w:proofErr w:type="spellStart"/>
+            <w:r>
+              <w:rPr>
+                <w:rFonts w:ascii="BRH Devanagari Extra" w:hAnsi="BRH Devanagari Extra" w:cs="BRH Devanagari Extra"/>
+                <w:color w:val="000000"/>
+                <w:sz w:val="40"/>
+                <w:szCs w:val="40"/>
+                <w:lang w:bidi="ml-IN"/>
+              </w:rPr>
+              <w:t>iÉxqÉÉ</w:t>
+            </w:r>
+            <w:proofErr w:type="spellEnd"/>
             <w:r>
               <w:rPr>
                 <w:rFonts w:ascii="BRH Malayalam Extra" w:hAnsi="BRH Malayalam Extra" w:cs="BRH Devanagari Extra"/>
@@ -2514,15 +2784,27 @@
               </w:rPr>
               <w:t>–</w:t>
             </w:r>
-            <w:r>
-              <w:rPr>
-                <w:rFonts w:ascii="BRH Devanagari Extra" w:hAnsi="BRH Devanagari Extra" w:cs="BRH Devanagari Extra"/>
-                <w:color w:val="000000"/>
-                <w:sz w:val="40"/>
-                <w:szCs w:val="40"/>
-                <w:lang w:bidi="ml-IN"/>
-              </w:rPr>
-              <w:t>SÉmÉþÈ |</w:t>
+            <w:proofErr w:type="spellStart"/>
+            <w:r>
+              <w:rPr>
+                <w:rFonts w:ascii="BRH Devanagari Extra" w:hAnsi="BRH Devanagari Extra" w:cs="BRH Devanagari Extra"/>
+                <w:color w:val="000000"/>
+                <w:sz w:val="40"/>
+                <w:szCs w:val="40"/>
+                <w:lang w:bidi="ml-IN"/>
+              </w:rPr>
+              <w:t>SÉmÉþÈ</w:t>
+            </w:r>
+            <w:proofErr w:type="spellEnd"/>
+            <w:r>
+              <w:rPr>
+                <w:rFonts w:ascii="BRH Devanagari Extra" w:hAnsi="BRH Devanagari Extra" w:cs="BRH Devanagari Extra"/>
+                <w:color w:val="000000"/>
+                <w:sz w:val="40"/>
+                <w:szCs w:val="40"/>
+                <w:lang w:bidi="ml-IN"/>
+              </w:rPr>
+              <w:t xml:space="preserve"> |</w:t>
             </w:r>
           </w:p>
         </w:tc>
@@ -2687,6 +2969,7 @@
               </w:rPr>
               <w:t xml:space="preserve"> </w:t>
             </w:r>
+            <w:proofErr w:type="spellStart"/>
             <w:r>
               <w:rPr>
                 <w:rFonts w:ascii="BRH Devanagari Extra" w:hAnsi="BRH Devanagari Extra" w:cs="BRH Devanagari Extra"/>
@@ -2698,6 +2981,7 @@
               </w:rPr>
               <w:t>lÉÈ</w:t>
             </w:r>
+            <w:proofErr w:type="spellEnd"/>
             <w:r>
               <w:rPr>
                 <w:rFonts w:ascii="BRH Devanagari Extra" w:hAnsi="BRH Devanagari Extra" w:cs="BRH Devanagari Extra"/>
@@ -2727,7 +3011,51 @@
                 <w:szCs w:val="40"/>
                 <w:lang w:bidi="ml-IN"/>
               </w:rPr>
-              <w:t xml:space="preserve"> CÌiÉþ lÉÈ ||</w:t>
+              <w:t xml:space="preserve"> </w:t>
+            </w:r>
+            <w:proofErr w:type="spellStart"/>
+            <w:r>
+              <w:rPr>
+                <w:rFonts w:ascii="BRH Devanagari Extra" w:hAnsi="BRH Devanagari Extra" w:cs="BRH Devanagari Extra"/>
+                <w:color w:val="000000"/>
+                <w:sz w:val="40"/>
+                <w:szCs w:val="40"/>
+                <w:lang w:bidi="ml-IN"/>
+              </w:rPr>
+              <w:t>CÌiÉþ</w:t>
+            </w:r>
+            <w:proofErr w:type="spellEnd"/>
+            <w:r>
+              <w:rPr>
+                <w:rFonts w:ascii="BRH Devanagari Extra" w:hAnsi="BRH Devanagari Extra" w:cs="BRH Devanagari Extra"/>
+                <w:color w:val="000000"/>
+                <w:sz w:val="40"/>
+                <w:szCs w:val="40"/>
+                <w:lang w:bidi="ml-IN"/>
+              </w:rPr>
+              <w:t xml:space="preserve"> </w:t>
+            </w:r>
+            <w:proofErr w:type="spellStart"/>
+            <w:r>
+              <w:rPr>
+                <w:rFonts w:ascii="BRH Devanagari Extra" w:hAnsi="BRH Devanagari Extra" w:cs="BRH Devanagari Extra"/>
+                <w:color w:val="000000"/>
+                <w:sz w:val="40"/>
+                <w:szCs w:val="40"/>
+                <w:lang w:bidi="ml-IN"/>
+              </w:rPr>
+              <w:t>lÉÈ</w:t>
+            </w:r>
+            <w:proofErr w:type="spellEnd"/>
+            <w:r>
+              <w:rPr>
+                <w:rFonts w:ascii="BRH Devanagari Extra" w:hAnsi="BRH Devanagari Extra" w:cs="BRH Devanagari Extra"/>
+                <w:color w:val="000000"/>
+                <w:sz w:val="40"/>
+                <w:szCs w:val="40"/>
+                <w:lang w:bidi="ml-IN"/>
+              </w:rPr>
+              <w:t xml:space="preserve"> ||</w:t>
             </w:r>
           </w:p>
         </w:tc>
@@ -2833,7 +3161,51 @@
                 <w:szCs w:val="40"/>
                 <w:lang w:bidi="ml-IN"/>
               </w:rPr>
-              <w:t xml:space="preserve"> CÌiÉþ lÉÈ ||</w:t>
+              <w:t xml:space="preserve"> </w:t>
+            </w:r>
+            <w:proofErr w:type="spellStart"/>
+            <w:r>
+              <w:rPr>
+                <w:rFonts w:ascii="BRH Devanagari Extra" w:hAnsi="BRH Devanagari Extra" w:cs="BRH Devanagari Extra"/>
+                <w:color w:val="000000"/>
+                <w:sz w:val="40"/>
+                <w:szCs w:val="40"/>
+                <w:lang w:bidi="ml-IN"/>
+              </w:rPr>
+              <w:t>CÌiÉþ</w:t>
+            </w:r>
+            <w:proofErr w:type="spellEnd"/>
+            <w:r>
+              <w:rPr>
+                <w:rFonts w:ascii="BRH Devanagari Extra" w:hAnsi="BRH Devanagari Extra" w:cs="BRH Devanagari Extra"/>
+                <w:color w:val="000000"/>
+                <w:sz w:val="40"/>
+                <w:szCs w:val="40"/>
+                <w:lang w:bidi="ml-IN"/>
+              </w:rPr>
+              <w:t xml:space="preserve"> </w:t>
+            </w:r>
+            <w:proofErr w:type="spellStart"/>
+            <w:r>
+              <w:rPr>
+                <w:rFonts w:ascii="BRH Devanagari Extra" w:hAnsi="BRH Devanagari Extra" w:cs="BRH Devanagari Extra"/>
+                <w:color w:val="000000"/>
+                <w:sz w:val="40"/>
+                <w:szCs w:val="40"/>
+                <w:lang w:bidi="ml-IN"/>
+              </w:rPr>
+              <w:t>lÉÈ</w:t>
+            </w:r>
+            <w:proofErr w:type="spellEnd"/>
+            <w:r>
+              <w:rPr>
+                <w:rFonts w:ascii="BRH Devanagari Extra" w:hAnsi="BRH Devanagari Extra" w:cs="BRH Devanagari Extra"/>
+                <w:color w:val="000000"/>
+                <w:sz w:val="40"/>
+                <w:szCs w:val="40"/>
+                <w:lang w:bidi="ml-IN"/>
+              </w:rPr>
+              <w:t xml:space="preserve"> ||</w:t>
             </w:r>
           </w:p>
         </w:tc>
@@ -2988,6 +3360,7 @@
               </w:rPr>
               <w:t>–</w:t>
             </w:r>
+            <w:proofErr w:type="spellStart"/>
             <w:r>
               <w:rPr>
                 <w:rFonts w:ascii="BRH Devanagari Extra" w:hAnsi="BRH Devanagari Extra" w:cs="BRH Devanagari Extra"/>
@@ -2998,6 +3371,7 @@
               </w:rPr>
               <w:t>lÉÉ</w:t>
             </w:r>
+            <w:proofErr w:type="spellEnd"/>
             <w:r>
               <w:rPr>
                 <w:rFonts w:ascii="BRH Malayalam Extra" w:hAnsi="BRH Malayalam Extra" w:cs="BRH Devanagari Extra"/>
@@ -3030,15 +3404,27 @@
               </w:rPr>
               <w:t>–</w:t>
             </w:r>
-            <w:r>
-              <w:rPr>
-                <w:rFonts w:ascii="BRH Devanagari Extra" w:hAnsi="BRH Devanagari Extra" w:cs="BRH Devanagari Extra"/>
-                <w:color w:val="000000"/>
-                <w:sz w:val="40"/>
-                <w:szCs w:val="40"/>
-                <w:lang w:bidi="ml-IN"/>
-              </w:rPr>
-              <w:t>uÉqÉç | L</w:t>
+            <w:proofErr w:type="spellStart"/>
+            <w:r>
+              <w:rPr>
+                <w:rFonts w:ascii="BRH Devanagari Extra" w:hAnsi="BRH Devanagari Extra" w:cs="BRH Devanagari Extra"/>
+                <w:color w:val="000000"/>
+                <w:sz w:val="40"/>
+                <w:szCs w:val="40"/>
+                <w:lang w:bidi="ml-IN"/>
+              </w:rPr>
+              <w:t>uÉqÉç</w:t>
+            </w:r>
+            <w:proofErr w:type="spellEnd"/>
+            <w:r>
+              <w:rPr>
+                <w:rFonts w:ascii="BRH Devanagari Extra" w:hAnsi="BRH Devanagari Extra" w:cs="BRH Devanagari Extra"/>
+                <w:color w:val="000000"/>
+                <w:sz w:val="40"/>
+                <w:szCs w:val="40"/>
+                <w:lang w:bidi="ml-IN"/>
+              </w:rPr>
+              <w:t xml:space="preserve"> | L</w:t>
             </w:r>
             <w:r>
               <w:rPr>
@@ -3051,6 +3437,7 @@
               </w:rPr>
               <w:t>–</w:t>
             </w:r>
+            <w:proofErr w:type="spellStart"/>
             <w:r>
               <w:rPr>
                 <w:rFonts w:ascii="BRH Devanagari Extra" w:hAnsi="BRH Devanagari Extra" w:cs="BRH Devanagari Extra"/>
@@ -3070,7 +3457,40 @@
                 <w:szCs w:val="40"/>
                 <w:lang w:bidi="ml-IN"/>
               </w:rPr>
-              <w:t>ç ÆuÉåSþ |</w:t>
+              <w:t>ç</w:t>
+            </w:r>
+            <w:proofErr w:type="spellEnd"/>
+            <w:r>
+              <w:rPr>
+                <w:rFonts w:ascii="BRH Devanagari Extra" w:hAnsi="BRH Devanagari Extra" w:cs="BRH Devanagari Extra"/>
+                <w:color w:val="000000"/>
+                <w:sz w:val="40"/>
+                <w:szCs w:val="40"/>
+                <w:lang w:bidi="ml-IN"/>
+              </w:rPr>
+              <w:t xml:space="preserve"> </w:t>
+            </w:r>
+            <w:proofErr w:type="spellStart"/>
+            <w:r>
+              <w:rPr>
+                <w:rFonts w:ascii="BRH Devanagari Extra" w:hAnsi="BRH Devanagari Extra" w:cs="BRH Devanagari Extra"/>
+                <w:color w:val="000000"/>
+                <w:sz w:val="40"/>
+                <w:szCs w:val="40"/>
+                <w:lang w:bidi="ml-IN"/>
+              </w:rPr>
+              <w:t>ÆuÉåSþ</w:t>
+            </w:r>
+            <w:proofErr w:type="spellEnd"/>
+            <w:r>
+              <w:rPr>
+                <w:rFonts w:ascii="BRH Devanagari Extra" w:hAnsi="BRH Devanagari Extra" w:cs="BRH Devanagari Extra"/>
+                <w:color w:val="000000"/>
+                <w:sz w:val="40"/>
+                <w:szCs w:val="40"/>
+                <w:lang w:bidi="ml-IN"/>
+              </w:rPr>
+              <w:t xml:space="preserve"> |</w:t>
             </w:r>
           </w:p>
         </w:tc>
@@ -3114,6 +3534,7 @@
               </w:rPr>
               <w:t>–</w:t>
             </w:r>
+            <w:proofErr w:type="spellStart"/>
             <w:r>
               <w:rPr>
                 <w:rFonts w:ascii="BRH Devanagari Extra" w:hAnsi="BRH Devanagari Extra" w:cs="BRH Devanagari Extra"/>
@@ -3124,6 +3545,7 @@
               </w:rPr>
               <w:t>lÉÉ</w:t>
             </w:r>
+            <w:proofErr w:type="spellEnd"/>
             <w:r>
               <w:rPr>
                 <w:rFonts w:ascii="BRH Malayalam Extra" w:hAnsi="BRH Malayalam Extra" w:cs="BRH Devanagari Extra"/>
@@ -3156,15 +3578,27 @@
               </w:rPr>
               <w:t>–</w:t>
             </w:r>
-            <w:r>
-              <w:rPr>
-                <w:rFonts w:ascii="BRH Devanagari Extra" w:hAnsi="BRH Devanagari Extra" w:cs="BRH Devanagari Extra"/>
-                <w:color w:val="000000"/>
-                <w:sz w:val="40"/>
-                <w:szCs w:val="40"/>
-                <w:lang w:bidi="ml-IN"/>
-              </w:rPr>
-              <w:t>uÉqÉç | L</w:t>
+            <w:proofErr w:type="spellStart"/>
+            <w:r>
+              <w:rPr>
+                <w:rFonts w:ascii="BRH Devanagari Extra" w:hAnsi="BRH Devanagari Extra" w:cs="BRH Devanagari Extra"/>
+                <w:color w:val="000000"/>
+                <w:sz w:val="40"/>
+                <w:szCs w:val="40"/>
+                <w:lang w:bidi="ml-IN"/>
+              </w:rPr>
+              <w:t>uÉqÉç</w:t>
+            </w:r>
+            <w:proofErr w:type="spellEnd"/>
+            <w:r>
+              <w:rPr>
+                <w:rFonts w:ascii="BRH Devanagari Extra" w:hAnsi="BRH Devanagari Extra" w:cs="BRH Devanagari Extra"/>
+                <w:color w:val="000000"/>
+                <w:sz w:val="40"/>
+                <w:szCs w:val="40"/>
+                <w:lang w:bidi="ml-IN"/>
+              </w:rPr>
+              <w:t xml:space="preserve"> | L</w:t>
             </w:r>
             <w:r>
               <w:rPr>
@@ -3178,6 +3612,7 @@
               </w:rPr>
               <w:t>–</w:t>
             </w:r>
+            <w:proofErr w:type="spellStart"/>
             <w:r>
               <w:rPr>
                 <w:rFonts w:ascii="BRH Devanagari Extra" w:hAnsi="BRH Devanagari Extra" w:cs="BRH Devanagari Extra"/>
@@ -3197,7 +3632,40 @@
                 <w:szCs w:val="40"/>
                 <w:lang w:bidi="ml-IN"/>
               </w:rPr>
-              <w:t>ç ÆuÉåSþ |</w:t>
+              <w:t>ç</w:t>
+            </w:r>
+            <w:proofErr w:type="spellEnd"/>
+            <w:r>
+              <w:rPr>
+                <w:rFonts w:ascii="BRH Devanagari Extra" w:hAnsi="BRH Devanagari Extra" w:cs="BRH Devanagari Extra"/>
+                <w:color w:val="000000"/>
+                <w:sz w:val="40"/>
+                <w:szCs w:val="40"/>
+                <w:lang w:bidi="ml-IN"/>
+              </w:rPr>
+              <w:t xml:space="preserve"> </w:t>
+            </w:r>
+            <w:proofErr w:type="spellStart"/>
+            <w:r>
+              <w:rPr>
+                <w:rFonts w:ascii="BRH Devanagari Extra" w:hAnsi="BRH Devanagari Extra" w:cs="BRH Devanagari Extra"/>
+                <w:color w:val="000000"/>
+                <w:sz w:val="40"/>
+                <w:szCs w:val="40"/>
+                <w:lang w:bidi="ml-IN"/>
+              </w:rPr>
+              <w:t>ÆuÉåSþ</w:t>
+            </w:r>
+            <w:proofErr w:type="spellEnd"/>
+            <w:r>
+              <w:rPr>
+                <w:rFonts w:ascii="BRH Devanagari Extra" w:hAnsi="BRH Devanagari Extra" w:cs="BRH Devanagari Extra"/>
+                <w:color w:val="000000"/>
+                <w:sz w:val="40"/>
+                <w:szCs w:val="40"/>
+                <w:lang w:bidi="ml-IN"/>
+              </w:rPr>
+              <w:t xml:space="preserve"> |</w:t>
             </w:r>
           </w:p>
         </w:tc>
@@ -3352,6 +3820,7 @@
               </w:rPr>
               <w:t>–</w:t>
             </w:r>
+            <w:proofErr w:type="spellStart"/>
             <w:r>
               <w:rPr>
                 <w:rFonts w:ascii="BRH Devanagari Extra" w:hAnsi="BRH Devanagari Extra" w:cs="BRH Devanagari Extra"/>
@@ -3362,6 +3831,7 @@
               </w:rPr>
               <w:t>kÉÉ</w:t>
             </w:r>
+            <w:proofErr w:type="spellEnd"/>
             <w:r>
               <w:rPr>
                 <w:rFonts w:ascii="BRH Malayalam Extra" w:hAnsi="BRH Malayalam Extra" w:cs="BRH Devanagari Extra"/>
@@ -3373,15 +3843,38 @@
               </w:rPr>
               <w:t>–</w:t>
             </w:r>
-            <w:r>
-              <w:rPr>
-                <w:rFonts w:ascii="BRH Devanagari Extra" w:hAnsi="BRH Devanagari Extra" w:cs="BRH Devanagari Extra"/>
-                <w:color w:val="000000"/>
-                <w:sz w:val="40"/>
-                <w:szCs w:val="40"/>
-                <w:lang w:bidi="ml-IN"/>
-              </w:rPr>
-              <w:t>irÉ§ÉÉÿ§É | A</w:t>
+            <w:proofErr w:type="spellStart"/>
+            <w:r>
+              <w:rPr>
+                <w:rFonts w:ascii="BRH Devanagari Extra" w:hAnsi="BRH Devanagari Extra" w:cs="BRH Devanagari Extra"/>
+                <w:color w:val="000000"/>
+                <w:sz w:val="40"/>
+                <w:szCs w:val="40"/>
+                <w:lang w:bidi="ml-IN"/>
+              </w:rPr>
+              <w:t>irÉ§ÉÉÿ§É</w:t>
+            </w:r>
+            <w:proofErr w:type="spellEnd"/>
+            <w:r>
+              <w:rPr>
+                <w:rFonts w:ascii="BRH Devanagari Extra" w:hAnsi="BRH Devanagari Extra" w:cs="BRH Devanagari Extra"/>
+                <w:color w:val="000000"/>
+                <w:sz w:val="40"/>
+                <w:szCs w:val="40"/>
+                <w:lang w:bidi="ml-IN"/>
+              </w:rPr>
+              <w:t xml:space="preserve"> | </w:t>
+            </w:r>
+            <w:proofErr w:type="spellStart"/>
+            <w:r>
+              <w:rPr>
+                <w:rFonts w:ascii="BRH Devanagari Extra" w:hAnsi="BRH Devanagari Extra" w:cs="BRH Devanagari Extra"/>
+                <w:color w:val="000000"/>
+                <w:sz w:val="40"/>
+                <w:szCs w:val="40"/>
+                <w:lang w:bidi="ml-IN"/>
+              </w:rPr>
+              <w:t>A</w:t>
             </w:r>
             <w:r>
               <w:rPr>
@@ -3404,6 +3897,7 @@
               </w:rPr>
               <w:t>ÿ§É</w:t>
             </w:r>
+            <w:proofErr w:type="spellEnd"/>
             <w:r>
               <w:rPr>
                 <w:rFonts w:ascii="BRH Malayalam Extra" w:hAnsi="BRH Malayalam Extra" w:cs="BRH Devanagari Extra"/>
@@ -3423,7 +3917,29 @@
                 <w:szCs w:val="40"/>
                 <w:lang w:bidi="ml-IN"/>
               </w:rPr>
-              <w:t xml:space="preserve"> uÉæ |</w:t>
+              <w:t xml:space="preserve"> </w:t>
+            </w:r>
+            <w:proofErr w:type="spellStart"/>
+            <w:r>
+              <w:rPr>
+                <w:rFonts w:ascii="BRH Devanagari Extra" w:hAnsi="BRH Devanagari Extra" w:cs="BRH Devanagari Extra"/>
+                <w:color w:val="000000"/>
+                <w:sz w:val="40"/>
+                <w:szCs w:val="40"/>
+                <w:lang w:bidi="ml-IN"/>
+              </w:rPr>
+              <w:t>uÉæ</w:t>
+            </w:r>
+            <w:proofErr w:type="spellEnd"/>
+            <w:r>
+              <w:rPr>
+                <w:rFonts w:ascii="BRH Devanagari Extra" w:hAnsi="BRH Devanagari Extra" w:cs="BRH Devanagari Extra"/>
+                <w:color w:val="000000"/>
+                <w:sz w:val="40"/>
+                <w:szCs w:val="40"/>
+                <w:lang w:bidi="ml-IN"/>
+              </w:rPr>
+              <w:t xml:space="preserve"> |</w:t>
             </w:r>
           </w:p>
         </w:tc>
@@ -3467,6 +3983,7 @@
               </w:rPr>
               <w:t>–</w:t>
             </w:r>
+            <w:proofErr w:type="spellStart"/>
             <w:r>
               <w:rPr>
                 <w:rFonts w:ascii="BRH Devanagari Extra" w:hAnsi="BRH Devanagari Extra" w:cs="BRH Devanagari Extra"/>
@@ -3477,6 +3994,7 @@
               </w:rPr>
               <w:t>kÉÉ</w:t>
             </w:r>
+            <w:proofErr w:type="spellEnd"/>
             <w:r>
               <w:rPr>
                 <w:rFonts w:ascii="BRH Malayalam Extra" w:hAnsi="BRH Malayalam Extra" w:cs="BRH Devanagari Extra"/>
@@ -3488,15 +4006,38 @@
               </w:rPr>
               <w:t>–</w:t>
             </w:r>
-            <w:r>
-              <w:rPr>
-                <w:rFonts w:ascii="BRH Devanagari Extra" w:hAnsi="BRH Devanagari Extra" w:cs="BRH Devanagari Extra"/>
-                <w:color w:val="000000"/>
-                <w:sz w:val="40"/>
-                <w:szCs w:val="40"/>
-                <w:lang w:bidi="ml-IN"/>
-              </w:rPr>
-              <w:t>irÉ§ÉÉÿ§É | A</w:t>
+            <w:proofErr w:type="spellStart"/>
+            <w:r>
+              <w:rPr>
+                <w:rFonts w:ascii="BRH Devanagari Extra" w:hAnsi="BRH Devanagari Extra" w:cs="BRH Devanagari Extra"/>
+                <w:color w:val="000000"/>
+                <w:sz w:val="40"/>
+                <w:szCs w:val="40"/>
+                <w:lang w:bidi="ml-IN"/>
+              </w:rPr>
+              <w:t>irÉ§ÉÉÿ§É</w:t>
+            </w:r>
+            <w:proofErr w:type="spellEnd"/>
+            <w:r>
+              <w:rPr>
+                <w:rFonts w:ascii="BRH Devanagari Extra" w:hAnsi="BRH Devanagari Extra" w:cs="BRH Devanagari Extra"/>
+                <w:color w:val="000000"/>
+                <w:sz w:val="40"/>
+                <w:szCs w:val="40"/>
+                <w:lang w:bidi="ml-IN"/>
+              </w:rPr>
+              <w:t xml:space="preserve"> | </w:t>
+            </w:r>
+            <w:proofErr w:type="spellStart"/>
+            <w:r>
+              <w:rPr>
+                <w:rFonts w:ascii="BRH Devanagari Extra" w:hAnsi="BRH Devanagari Extra" w:cs="BRH Devanagari Extra"/>
+                <w:color w:val="000000"/>
+                <w:sz w:val="40"/>
+                <w:szCs w:val="40"/>
+                <w:lang w:bidi="ml-IN"/>
+              </w:rPr>
+              <w:t>A</w:t>
             </w:r>
             <w:r>
               <w:rPr>
@@ -3530,6 +4071,7 @@
               </w:rPr>
               <w:t>§É</w:t>
             </w:r>
+            <w:proofErr w:type="spellEnd"/>
             <w:r>
               <w:rPr>
                 <w:rFonts w:ascii="BRH Malayalam Extra" w:hAnsi="BRH Malayalam Extra" w:cs="BRH Devanagari Extra"/>
@@ -3549,7 +4091,29 @@
                 <w:szCs w:val="40"/>
                 <w:lang w:bidi="ml-IN"/>
               </w:rPr>
-              <w:t xml:space="preserve"> uÉæ |</w:t>
+              <w:t xml:space="preserve"> </w:t>
+            </w:r>
+            <w:proofErr w:type="spellStart"/>
+            <w:r>
+              <w:rPr>
+                <w:rFonts w:ascii="BRH Devanagari Extra" w:hAnsi="BRH Devanagari Extra" w:cs="BRH Devanagari Extra"/>
+                <w:color w:val="000000"/>
+                <w:sz w:val="40"/>
+                <w:szCs w:val="40"/>
+                <w:lang w:bidi="ml-IN"/>
+              </w:rPr>
+              <w:t>uÉæ</w:t>
+            </w:r>
+            <w:proofErr w:type="spellEnd"/>
+            <w:r>
+              <w:rPr>
+                <w:rFonts w:ascii="BRH Devanagari Extra" w:hAnsi="BRH Devanagari Extra" w:cs="BRH Devanagari Extra"/>
+                <w:color w:val="000000"/>
+                <w:sz w:val="40"/>
+                <w:szCs w:val="40"/>
+                <w:lang w:bidi="ml-IN"/>
+              </w:rPr>
+              <w:t xml:space="preserve"> |</w:t>
             </w:r>
           </w:p>
         </w:tc>
@@ -3747,6 +4311,7 @@
               </w:rPr>
               <w:t>–</w:t>
             </w:r>
+            <w:proofErr w:type="spellStart"/>
             <w:r>
               <w:rPr>
                 <w:rFonts w:ascii="BRH Devanagari Extra" w:hAnsi="BRH Devanagari Extra" w:cs="BRH Devanagari Extra"/>
@@ -3757,6 +4322,7 @@
               </w:rPr>
               <w:t>ÎxqÉ</w:t>
             </w:r>
+            <w:proofErr w:type="spellEnd"/>
             <w:r>
               <w:rPr>
                 <w:rFonts w:ascii="BRH Malayalam Extra" w:hAnsi="BRH Malayalam Extra" w:cs="BRH Devanagari Extra"/>
@@ -3883,6 +4449,7 @@
               </w:rPr>
               <w:t>–</w:t>
             </w:r>
+            <w:proofErr w:type="spellStart"/>
             <w:r>
               <w:rPr>
                 <w:rFonts w:ascii="BRH Devanagari Extra" w:hAnsi="BRH Devanagari Extra" w:cs="BRH Devanagari Extra"/>
@@ -3893,6 +4460,7 @@
               </w:rPr>
               <w:t>ÎxqÉ</w:t>
             </w:r>
+            <w:proofErr w:type="spellEnd"/>
             <w:r>
               <w:rPr>
                 <w:rFonts w:ascii="BRH Malayalam Extra" w:hAnsi="BRH Malayalam Extra" w:cs="BRH Devanagari Extra"/>
@@ -4067,15 +4635,27 @@
                 <w:lang w:val="en-IN" w:eastAsia="en-IN" w:bidi="ml-IN"/>
               </w:rPr>
             </w:pPr>
-            <w:r>
-              <w:rPr>
-                <w:rFonts w:ascii="BRH Devanagari Extra" w:hAnsi="BRH Devanagari Extra" w:cs="BRH Devanagari Extra"/>
-                <w:color w:val="000000"/>
-                <w:sz w:val="40"/>
-                <w:szCs w:val="40"/>
-                <w:lang w:bidi="ml-IN"/>
-              </w:rPr>
-              <w:t>AÂþhÉÏÍpÉÈ xÉ</w:t>
+            <w:proofErr w:type="spellStart"/>
+            <w:r>
+              <w:rPr>
+                <w:rFonts w:ascii="BRH Devanagari Extra" w:hAnsi="BRH Devanagari Extra" w:cs="BRH Devanagari Extra"/>
+                <w:color w:val="000000"/>
+                <w:sz w:val="40"/>
+                <w:szCs w:val="40"/>
+                <w:lang w:bidi="ml-IN"/>
+              </w:rPr>
+              <w:t>AÂþhÉÏÍpÉÈ</w:t>
+            </w:r>
+            <w:proofErr w:type="spellEnd"/>
+            <w:r>
+              <w:rPr>
+                <w:rFonts w:ascii="BRH Devanagari Extra" w:hAnsi="BRH Devanagari Extra" w:cs="BRH Devanagari Extra"/>
+                <w:color w:val="000000"/>
+                <w:sz w:val="40"/>
+                <w:szCs w:val="40"/>
+                <w:lang w:bidi="ml-IN"/>
+              </w:rPr>
+              <w:t xml:space="preserve"> xÉ</w:t>
             </w:r>
             <w:r>
               <w:rPr>
@@ -4088,15 +4668,27 @@
               </w:rPr>
               <w:t>–</w:t>
             </w:r>
-            <w:r>
-              <w:rPr>
-                <w:rFonts w:ascii="BRH Devanagari Extra" w:hAnsi="BRH Devanagari Extra" w:cs="BRH Devanagari Extra"/>
-                <w:color w:val="000000"/>
-                <w:sz w:val="40"/>
-                <w:szCs w:val="40"/>
-                <w:lang w:bidi="ml-IN"/>
-              </w:rPr>
-              <w:t>eÉÔÈ | xÉ</w:t>
+            <w:proofErr w:type="spellStart"/>
+            <w:r>
+              <w:rPr>
+                <w:rFonts w:ascii="BRH Devanagari Extra" w:hAnsi="BRH Devanagari Extra" w:cs="BRH Devanagari Extra"/>
+                <w:color w:val="000000"/>
+                <w:sz w:val="40"/>
+                <w:szCs w:val="40"/>
+                <w:lang w:bidi="ml-IN"/>
+              </w:rPr>
+              <w:t>eÉÔÈ</w:t>
+            </w:r>
+            <w:proofErr w:type="spellEnd"/>
+            <w:r>
+              <w:rPr>
+                <w:rFonts w:ascii="BRH Devanagari Extra" w:hAnsi="BRH Devanagari Extra" w:cs="BRH Devanagari Extra"/>
+                <w:color w:val="000000"/>
+                <w:sz w:val="40"/>
+                <w:szCs w:val="40"/>
+                <w:lang w:bidi="ml-IN"/>
+              </w:rPr>
+              <w:t xml:space="preserve"> | xÉ</w:t>
             </w:r>
             <w:r>
               <w:rPr>
@@ -4109,15 +4701,38 @@
               </w:rPr>
               <w:t>–</w:t>
             </w:r>
-            <w:r>
-              <w:rPr>
-                <w:rFonts w:ascii="BRH Devanagari Extra" w:hAnsi="BRH Devanagari Extra" w:cs="BRH Devanagari Extra"/>
-                <w:color w:val="000000"/>
-                <w:sz w:val="40"/>
-                <w:szCs w:val="40"/>
-                <w:lang w:bidi="ml-IN"/>
-              </w:rPr>
-              <w:t>eÉÔÈ xÉÔ</w:t>
+            <w:proofErr w:type="spellStart"/>
+            <w:r>
+              <w:rPr>
+                <w:rFonts w:ascii="BRH Devanagari Extra" w:hAnsi="BRH Devanagari Extra" w:cs="BRH Devanagari Extra"/>
+                <w:color w:val="000000"/>
+                <w:sz w:val="40"/>
+                <w:szCs w:val="40"/>
+                <w:lang w:bidi="ml-IN"/>
+              </w:rPr>
+              <w:t>eÉÔÈ</w:t>
+            </w:r>
+            <w:proofErr w:type="spellEnd"/>
+            <w:r>
+              <w:rPr>
+                <w:rFonts w:ascii="BRH Devanagari Extra" w:hAnsi="BRH Devanagari Extra" w:cs="BRH Devanagari Extra"/>
+                <w:color w:val="000000"/>
+                <w:sz w:val="40"/>
+                <w:szCs w:val="40"/>
+                <w:lang w:bidi="ml-IN"/>
+              </w:rPr>
+              <w:t xml:space="preserve"> </w:t>
+            </w:r>
+            <w:proofErr w:type="spellStart"/>
+            <w:r>
+              <w:rPr>
+                <w:rFonts w:ascii="BRH Devanagari Extra" w:hAnsi="BRH Devanagari Extra" w:cs="BRH Devanagari Extra"/>
+                <w:color w:val="000000"/>
+                <w:sz w:val="40"/>
+                <w:szCs w:val="40"/>
+                <w:lang w:bidi="ml-IN"/>
+              </w:rPr>
+              <w:t>xÉÔ</w:t>
             </w:r>
             <w:r>
               <w:rPr>
@@ -4138,7 +4753,18 @@
                 <w:szCs w:val="40"/>
                 <w:lang w:bidi="ml-IN"/>
               </w:rPr>
-              <w:t>ïþ |</w:t>
+              <w:t>ïþ</w:t>
+            </w:r>
+            <w:proofErr w:type="spellEnd"/>
+            <w:r>
+              <w:rPr>
+                <w:rFonts w:ascii="BRH Devanagari Extra" w:hAnsi="BRH Devanagari Extra" w:cs="BRH Devanagari Extra"/>
+                <w:color w:val="000000"/>
+                <w:sz w:val="40"/>
+                <w:szCs w:val="40"/>
+                <w:lang w:bidi="ml-IN"/>
+              </w:rPr>
+              <w:t xml:space="preserve"> |</w:t>
             </w:r>
           </w:p>
         </w:tc>
@@ -4161,15 +4787,27 @@
                 <w:lang w:val="en-IN" w:eastAsia="en-IN" w:bidi="ml-IN"/>
               </w:rPr>
             </w:pPr>
-            <w:r>
-              <w:rPr>
-                <w:rFonts w:ascii="BRH Devanagari Extra" w:hAnsi="BRH Devanagari Extra" w:cs="BRH Devanagari Extra"/>
-                <w:color w:val="000000"/>
-                <w:sz w:val="40"/>
-                <w:szCs w:val="40"/>
-                <w:lang w:bidi="ml-IN"/>
-              </w:rPr>
-              <w:t>AÂþhÉÏÍpÉÈ xÉ</w:t>
+            <w:proofErr w:type="spellStart"/>
+            <w:r>
+              <w:rPr>
+                <w:rFonts w:ascii="BRH Devanagari Extra" w:hAnsi="BRH Devanagari Extra" w:cs="BRH Devanagari Extra"/>
+                <w:color w:val="000000"/>
+                <w:sz w:val="40"/>
+                <w:szCs w:val="40"/>
+                <w:lang w:bidi="ml-IN"/>
+              </w:rPr>
+              <w:t>AÂþhÉÏÍpÉÈ</w:t>
+            </w:r>
+            <w:proofErr w:type="spellEnd"/>
+            <w:r>
+              <w:rPr>
+                <w:rFonts w:ascii="BRH Devanagari Extra" w:hAnsi="BRH Devanagari Extra" w:cs="BRH Devanagari Extra"/>
+                <w:color w:val="000000"/>
+                <w:sz w:val="40"/>
+                <w:szCs w:val="40"/>
+                <w:lang w:bidi="ml-IN"/>
+              </w:rPr>
+              <w:t xml:space="preserve"> xÉ</w:t>
             </w:r>
             <w:r>
               <w:rPr>
@@ -4182,15 +4820,27 @@
               </w:rPr>
               <w:t>–</w:t>
             </w:r>
-            <w:r>
-              <w:rPr>
-                <w:rFonts w:ascii="BRH Devanagari Extra" w:hAnsi="BRH Devanagari Extra" w:cs="BRH Devanagari Extra"/>
-                <w:color w:val="000000"/>
-                <w:sz w:val="40"/>
-                <w:szCs w:val="40"/>
-                <w:lang w:bidi="ml-IN"/>
-              </w:rPr>
-              <w:t>eÉÔÈ | xÉ</w:t>
+            <w:proofErr w:type="spellStart"/>
+            <w:r>
+              <w:rPr>
+                <w:rFonts w:ascii="BRH Devanagari Extra" w:hAnsi="BRH Devanagari Extra" w:cs="BRH Devanagari Extra"/>
+                <w:color w:val="000000"/>
+                <w:sz w:val="40"/>
+                <w:szCs w:val="40"/>
+                <w:lang w:bidi="ml-IN"/>
+              </w:rPr>
+              <w:t>eÉÔÈ</w:t>
+            </w:r>
+            <w:proofErr w:type="spellEnd"/>
+            <w:r>
+              <w:rPr>
+                <w:rFonts w:ascii="BRH Devanagari Extra" w:hAnsi="BRH Devanagari Extra" w:cs="BRH Devanagari Extra"/>
+                <w:color w:val="000000"/>
+                <w:sz w:val="40"/>
+                <w:szCs w:val="40"/>
+                <w:lang w:bidi="ml-IN"/>
+              </w:rPr>
+              <w:t xml:space="preserve"> | xÉ</w:t>
             </w:r>
             <w:r>
               <w:rPr>
@@ -4203,15 +4853,38 @@
               </w:rPr>
               <w:t>–</w:t>
             </w:r>
-            <w:r>
-              <w:rPr>
-                <w:rFonts w:ascii="BRH Devanagari Extra" w:hAnsi="BRH Devanagari Extra" w:cs="BRH Devanagari Extra"/>
-                <w:color w:val="000000"/>
-                <w:sz w:val="40"/>
-                <w:szCs w:val="40"/>
-                <w:lang w:bidi="ml-IN"/>
-              </w:rPr>
-              <w:t>eÉÔÈ xÉÔ</w:t>
+            <w:proofErr w:type="spellStart"/>
+            <w:r>
+              <w:rPr>
+                <w:rFonts w:ascii="BRH Devanagari Extra" w:hAnsi="BRH Devanagari Extra" w:cs="BRH Devanagari Extra"/>
+                <w:color w:val="000000"/>
+                <w:sz w:val="40"/>
+                <w:szCs w:val="40"/>
+                <w:lang w:bidi="ml-IN"/>
+              </w:rPr>
+              <w:t>eÉÔÈ</w:t>
+            </w:r>
+            <w:proofErr w:type="spellEnd"/>
+            <w:r>
+              <w:rPr>
+                <w:rFonts w:ascii="BRH Devanagari Extra" w:hAnsi="BRH Devanagari Extra" w:cs="BRH Devanagari Extra"/>
+                <w:color w:val="000000"/>
+                <w:sz w:val="40"/>
+                <w:szCs w:val="40"/>
+                <w:lang w:bidi="ml-IN"/>
+              </w:rPr>
+              <w:t xml:space="preserve"> </w:t>
+            </w:r>
+            <w:proofErr w:type="spellStart"/>
+            <w:r>
+              <w:rPr>
+                <w:rFonts w:ascii="BRH Devanagari Extra" w:hAnsi="BRH Devanagari Extra" w:cs="BRH Devanagari Extra"/>
+                <w:color w:val="000000"/>
+                <w:sz w:val="40"/>
+                <w:szCs w:val="40"/>
+                <w:lang w:bidi="ml-IN"/>
+              </w:rPr>
+              <w:t>xÉÔ</w:t>
             </w:r>
             <w:r>
               <w:rPr>
@@ -4224,6 +4897,7 @@
               </w:rPr>
               <w:t>rÉïþÈ</w:t>
             </w:r>
+            <w:proofErr w:type="spellEnd"/>
             <w:r>
               <w:rPr>
                 <w:rFonts w:ascii="BRH Devanagari Extra" w:hAnsi="BRH Devanagari Extra" w:cs="BRH Devanagari Extra"/>
@@ -4366,6 +5040,7 @@
                 <w:lang w:val="en-IN" w:eastAsia="en-IN" w:bidi="ml-IN"/>
               </w:rPr>
             </w:pPr>
+            <w:proofErr w:type="spellStart"/>
             <w:r>
               <w:rPr>
                 <w:rFonts w:ascii="BRH Devanagari Extra" w:hAnsi="BRH Devanagari Extra" w:cs="BRH Devanagari Extra"/>
@@ -4385,17 +5060,51 @@
                 <w:highlight w:val="yellow"/>
                 <w:lang w:bidi="ml-IN"/>
               </w:rPr>
-              <w:t>NûlÉç.</w:t>
-            </w:r>
-            <w:r>
-              <w:rPr>
-                <w:rFonts w:ascii="BRH Devanagari Extra" w:hAnsi="BRH Devanagari Extra" w:cs="BRH Devanagari Extra"/>
-                <w:color w:val="000000"/>
-                <w:sz w:val="40"/>
-                <w:szCs w:val="40"/>
-                <w:lang w:bidi="ml-IN"/>
-              </w:rPr>
-              <w:t xml:space="preserve"> rÉÈ | rÉ L</w:t>
+              <w:t>NûlÉç</w:t>
+            </w:r>
+            <w:proofErr w:type="spellEnd"/>
+            <w:r>
+              <w:rPr>
+                <w:rFonts w:ascii="BRH Devanagari Extra" w:hAnsi="BRH Devanagari Extra" w:cs="BRH Devanagari Extra"/>
+                <w:color w:val="000000"/>
+                <w:sz w:val="40"/>
+                <w:szCs w:val="40"/>
+                <w:highlight w:val="yellow"/>
+                <w:lang w:bidi="ml-IN"/>
+              </w:rPr>
+              <w:t>.</w:t>
+            </w:r>
+            <w:r>
+              <w:rPr>
+                <w:rFonts w:ascii="BRH Devanagari Extra" w:hAnsi="BRH Devanagari Extra" w:cs="BRH Devanagari Extra"/>
+                <w:color w:val="000000"/>
+                <w:sz w:val="40"/>
+                <w:szCs w:val="40"/>
+                <w:lang w:bidi="ml-IN"/>
+              </w:rPr>
+              <w:t xml:space="preserve"> </w:t>
+            </w:r>
+            <w:proofErr w:type="spellStart"/>
+            <w:r>
+              <w:rPr>
+                <w:rFonts w:ascii="BRH Devanagari Extra" w:hAnsi="BRH Devanagari Extra" w:cs="BRH Devanagari Extra"/>
+                <w:color w:val="000000"/>
+                <w:sz w:val="40"/>
+                <w:szCs w:val="40"/>
+                <w:lang w:bidi="ml-IN"/>
+              </w:rPr>
+              <w:t>rÉÈ</w:t>
+            </w:r>
+            <w:proofErr w:type="spellEnd"/>
+            <w:r>
+              <w:rPr>
+                <w:rFonts w:ascii="BRH Devanagari Extra" w:hAnsi="BRH Devanagari Extra" w:cs="BRH Devanagari Extra"/>
+                <w:color w:val="000000"/>
+                <w:sz w:val="40"/>
+                <w:szCs w:val="40"/>
+                <w:lang w:bidi="ml-IN"/>
+              </w:rPr>
+              <w:t xml:space="preserve"> | rÉ L</w:t>
             </w:r>
             <w:r>
               <w:rPr>
@@ -4408,15 +5117,27 @@
               </w:rPr>
               <w:t>–</w:t>
             </w:r>
-            <w:r>
-              <w:rPr>
-                <w:rFonts w:ascii="BRH Devanagari Extra" w:hAnsi="BRH Devanagari Extra" w:cs="BRH Devanagari Extra"/>
-                <w:color w:val="000000"/>
-                <w:sz w:val="40"/>
-                <w:szCs w:val="40"/>
-                <w:lang w:bidi="ml-IN"/>
-              </w:rPr>
-              <w:t>uÉqÉç |</w:t>
+            <w:proofErr w:type="spellStart"/>
+            <w:r>
+              <w:rPr>
+                <w:rFonts w:ascii="BRH Devanagari Extra" w:hAnsi="BRH Devanagari Extra" w:cs="BRH Devanagari Extra"/>
+                <w:color w:val="000000"/>
+                <w:sz w:val="40"/>
+                <w:szCs w:val="40"/>
+                <w:lang w:bidi="ml-IN"/>
+              </w:rPr>
+              <w:t>uÉqÉç</w:t>
+            </w:r>
+            <w:proofErr w:type="spellEnd"/>
+            <w:r>
+              <w:rPr>
+                <w:rFonts w:ascii="BRH Devanagari Extra" w:hAnsi="BRH Devanagari Extra" w:cs="BRH Devanagari Extra"/>
+                <w:color w:val="000000"/>
+                <w:sz w:val="40"/>
+                <w:szCs w:val="40"/>
+                <w:lang w:bidi="ml-IN"/>
+              </w:rPr>
+              <w:t xml:space="preserve"> |</w:t>
             </w:r>
           </w:p>
         </w:tc>
@@ -4439,6 +5160,7 @@
                 <w:lang w:val="en-IN" w:eastAsia="en-IN" w:bidi="ml-IN"/>
               </w:rPr>
             </w:pPr>
+            <w:proofErr w:type="spellStart"/>
             <w:r>
               <w:rPr>
                 <w:rFonts w:ascii="BRH Devanagari Extra" w:hAnsi="BRH Devanagari Extra" w:cs="BRH Devanagari Extra"/>
@@ -4460,6 +5182,7 @@
               </w:rPr>
               <w:t>þcN</w:t>
             </w:r>
+            <w:proofErr w:type="spellEnd"/>
             <w:r>
               <w:rPr>
                 <w:rFonts w:ascii="BRH Malayalam Extra" w:hAnsi="BRH Malayalam Extra" w:cs="BRH Devanagari Extra"/>
@@ -4472,6 +5195,7 @@
               </w:rPr>
               <w:t>–</w:t>
             </w:r>
+            <w:proofErr w:type="spellStart"/>
             <w:r>
               <w:rPr>
                 <w:rFonts w:ascii="BRH Devanagari Extra" w:hAnsi="BRH Devanagari Extra" w:cs="BRH Devanagari Extra"/>
@@ -4483,6 +5207,7 @@
               </w:rPr>
               <w:t>ûlÉç</w:t>
             </w:r>
+            <w:proofErr w:type="spellEnd"/>
             <w:r>
               <w:rPr>
                 <w:rFonts w:ascii="BRH Malayalam Extra" w:hAnsi="BRH Malayalam Extra" w:cs="BRH Devanagari Extra"/>
@@ -4514,7 +5239,29 @@
                 <w:szCs w:val="40"/>
                 <w:lang w:bidi="ml-IN"/>
               </w:rPr>
-              <w:t xml:space="preserve"> rÉÈ | rÉ L</w:t>
+              <w:t xml:space="preserve"> </w:t>
+            </w:r>
+            <w:proofErr w:type="spellStart"/>
+            <w:r>
+              <w:rPr>
+                <w:rFonts w:ascii="BRH Devanagari Extra" w:hAnsi="BRH Devanagari Extra" w:cs="BRH Devanagari Extra"/>
+                <w:color w:val="000000"/>
+                <w:sz w:val="40"/>
+                <w:szCs w:val="40"/>
+                <w:lang w:bidi="ml-IN"/>
+              </w:rPr>
+              <w:t>rÉÈ</w:t>
+            </w:r>
+            <w:proofErr w:type="spellEnd"/>
+            <w:r>
+              <w:rPr>
+                <w:rFonts w:ascii="BRH Devanagari Extra" w:hAnsi="BRH Devanagari Extra" w:cs="BRH Devanagari Extra"/>
+                <w:color w:val="000000"/>
+                <w:sz w:val="40"/>
+                <w:szCs w:val="40"/>
+                <w:lang w:bidi="ml-IN"/>
+              </w:rPr>
+              <w:t xml:space="preserve"> | rÉ L</w:t>
             </w:r>
             <w:r>
               <w:rPr>
@@ -4527,15 +5274,27 @@
               </w:rPr>
               <w:t>–</w:t>
             </w:r>
-            <w:r>
-              <w:rPr>
-                <w:rFonts w:ascii="BRH Devanagari Extra" w:hAnsi="BRH Devanagari Extra" w:cs="BRH Devanagari Extra"/>
-                <w:color w:val="000000"/>
-                <w:sz w:val="40"/>
-                <w:szCs w:val="40"/>
-                <w:lang w:bidi="ml-IN"/>
-              </w:rPr>
-              <w:t>uÉqÉç |</w:t>
+            <w:proofErr w:type="spellStart"/>
+            <w:r>
+              <w:rPr>
+                <w:rFonts w:ascii="BRH Devanagari Extra" w:hAnsi="BRH Devanagari Extra" w:cs="BRH Devanagari Extra"/>
+                <w:color w:val="000000"/>
+                <w:sz w:val="40"/>
+                <w:szCs w:val="40"/>
+                <w:lang w:bidi="ml-IN"/>
+              </w:rPr>
+              <w:t>uÉqÉç</w:t>
+            </w:r>
+            <w:proofErr w:type="spellEnd"/>
+            <w:r>
+              <w:rPr>
+                <w:rFonts w:ascii="BRH Devanagari Extra" w:hAnsi="BRH Devanagari Extra" w:cs="BRH Devanagari Extra"/>
+                <w:color w:val="000000"/>
+                <w:sz w:val="40"/>
+                <w:szCs w:val="40"/>
+                <w:lang w:bidi="ml-IN"/>
+              </w:rPr>
+              <w:t xml:space="preserve"> |</w:t>
             </w:r>
           </w:p>
         </w:tc>
@@ -4690,6 +5449,7 @@
               </w:rPr>
               <w:t>–</w:t>
             </w:r>
+            <w:proofErr w:type="spellStart"/>
             <w:r>
               <w:rPr>
                 <w:rFonts w:ascii="BRH Devanagari Extra" w:hAnsi="BRH Devanagari Extra" w:cs="BRH Devanagari Extra"/>
@@ -4700,6 +5460,7 @@
               </w:rPr>
               <w:t>iqÉlÉÉ</w:t>
             </w:r>
+            <w:proofErr w:type="spellEnd"/>
             <w:r>
               <w:rPr>
                 <w:rFonts w:ascii="BRH Malayalam Extra" w:hAnsi="BRH Malayalam Extra" w:cs="BRH Devanagari Extra"/>
@@ -4711,15 +5472,27 @@
               </w:rPr>
               <w:t>–</w:t>
             </w:r>
-            <w:r>
-              <w:rPr>
-                <w:rFonts w:ascii="BRH Devanagari Extra" w:hAnsi="BRH Devanagari Extra" w:cs="BRH Devanagari Extra"/>
-                <w:color w:val="000000"/>
-                <w:sz w:val="40"/>
-                <w:szCs w:val="40"/>
-                <w:lang w:bidi="ml-IN"/>
-              </w:rPr>
-              <w:t xml:space="preserve">ÅprÉÉUÉåþWûÌiÉ | </w:t>
+            <w:proofErr w:type="spellStart"/>
+            <w:r>
+              <w:rPr>
+                <w:rFonts w:ascii="BRH Devanagari Extra" w:hAnsi="BRH Devanagari Extra" w:cs="BRH Devanagari Extra"/>
+                <w:color w:val="000000"/>
+                <w:sz w:val="40"/>
+                <w:szCs w:val="40"/>
+                <w:lang w:bidi="ml-IN"/>
+              </w:rPr>
+              <w:t>ÅprÉÉUÉåþWûÌiÉ</w:t>
+            </w:r>
+            <w:proofErr w:type="spellEnd"/>
+            <w:r>
+              <w:rPr>
+                <w:rFonts w:ascii="BRH Devanagari Extra" w:hAnsi="BRH Devanagari Extra" w:cs="BRH Devanagari Extra"/>
+                <w:color w:val="000000"/>
+                <w:sz w:val="40"/>
+                <w:szCs w:val="40"/>
+                <w:lang w:bidi="ml-IN"/>
+              </w:rPr>
+              <w:t xml:space="preserve"> | </w:t>
             </w:r>
           </w:p>
           <w:p>
@@ -4758,6 +5531,7 @@
               </w:rPr>
               <w:t>–</w:t>
             </w:r>
+            <w:proofErr w:type="spellStart"/>
             <w:r>
               <w:rPr>
                 <w:rFonts w:ascii="BRH Devanagari Extra" w:hAnsi="BRH Devanagari Extra" w:cs="BRH Devanagari Extra"/>
@@ -4789,6 +5563,7 @@
               </w:rPr>
               <w:t>û</w:t>
             </w:r>
+            <w:proofErr w:type="spellEnd"/>
             <w:r>
               <w:rPr>
                 <w:rFonts w:ascii="BRH Malayalam Extra" w:hAnsi="BRH Malayalam Extra" w:cs="BRH Devanagari Extra"/>
@@ -4800,15 +5575,49 @@
               </w:rPr>
               <w:t>–</w:t>
             </w:r>
-            <w:r>
-              <w:rPr>
-                <w:rFonts w:ascii="BRH Devanagari Extra" w:hAnsi="BRH Devanagari Extra" w:cs="BRH Devanagari Extra"/>
-                <w:color w:val="000000"/>
-                <w:sz w:val="40"/>
-                <w:szCs w:val="40"/>
-                <w:lang w:bidi="ml-IN"/>
-              </w:rPr>
-              <w:t>ÌiÉ iÉxqÉÉÿiÉç |</w:t>
+            <w:proofErr w:type="spellStart"/>
+            <w:r>
+              <w:rPr>
+                <w:rFonts w:ascii="BRH Devanagari Extra" w:hAnsi="BRH Devanagari Extra" w:cs="BRH Devanagari Extra"/>
+                <w:color w:val="000000"/>
+                <w:sz w:val="40"/>
+                <w:szCs w:val="40"/>
+                <w:lang w:bidi="ml-IN"/>
+              </w:rPr>
+              <w:t>ÌiÉ</w:t>
+            </w:r>
+            <w:proofErr w:type="spellEnd"/>
+            <w:r>
+              <w:rPr>
+                <w:rFonts w:ascii="BRH Devanagari Extra" w:hAnsi="BRH Devanagari Extra" w:cs="BRH Devanagari Extra"/>
+                <w:color w:val="000000"/>
+                <w:sz w:val="40"/>
+                <w:szCs w:val="40"/>
+                <w:lang w:bidi="ml-IN"/>
+              </w:rPr>
+              <w:t xml:space="preserve"> </w:t>
+            </w:r>
+            <w:proofErr w:type="spellStart"/>
+            <w:r>
+              <w:rPr>
+                <w:rFonts w:ascii="BRH Devanagari Extra" w:hAnsi="BRH Devanagari Extra" w:cs="BRH Devanagari Extra"/>
+                <w:color w:val="000000"/>
+                <w:sz w:val="40"/>
+                <w:szCs w:val="40"/>
+                <w:lang w:bidi="ml-IN"/>
+              </w:rPr>
+              <w:t>iÉxqÉÉÿiÉç</w:t>
+            </w:r>
+            <w:proofErr w:type="spellEnd"/>
+            <w:r>
+              <w:rPr>
+                <w:rFonts w:ascii="BRH Devanagari Extra" w:hAnsi="BRH Devanagari Extra" w:cs="BRH Devanagari Extra"/>
+                <w:color w:val="000000"/>
+                <w:sz w:val="40"/>
+                <w:szCs w:val="40"/>
+                <w:lang w:bidi="ml-IN"/>
+              </w:rPr>
+              <w:t xml:space="preserve"> |</w:t>
             </w:r>
           </w:p>
         </w:tc>
@@ -4852,6 +5661,7 @@
               </w:rPr>
               <w:t>–</w:t>
             </w:r>
+            <w:proofErr w:type="spellStart"/>
             <w:r>
               <w:rPr>
                 <w:rFonts w:ascii="BRH Devanagari Extra" w:hAnsi="BRH Devanagari Extra" w:cs="BRH Devanagari Extra"/>
@@ -4862,6 +5672,7 @@
               </w:rPr>
               <w:t>iqÉlÉÉ</w:t>
             </w:r>
+            <w:proofErr w:type="spellEnd"/>
             <w:r>
               <w:rPr>
                 <w:rFonts w:ascii="BRH Malayalam Extra" w:hAnsi="BRH Malayalam Extra" w:cs="BRH Devanagari Extra"/>
@@ -4873,15 +5684,27 @@
               </w:rPr>
               <w:t>–</w:t>
             </w:r>
-            <w:r>
-              <w:rPr>
-                <w:rFonts w:ascii="BRH Devanagari Extra" w:hAnsi="BRH Devanagari Extra" w:cs="BRH Devanagari Extra"/>
-                <w:color w:val="000000"/>
-                <w:sz w:val="40"/>
-                <w:szCs w:val="40"/>
-                <w:lang w:bidi="ml-IN"/>
-              </w:rPr>
-              <w:t xml:space="preserve">ÅprÉÉUÉåþWûÌiÉ | </w:t>
+            <w:proofErr w:type="spellStart"/>
+            <w:r>
+              <w:rPr>
+                <w:rFonts w:ascii="BRH Devanagari Extra" w:hAnsi="BRH Devanagari Extra" w:cs="BRH Devanagari Extra"/>
+                <w:color w:val="000000"/>
+                <w:sz w:val="40"/>
+                <w:szCs w:val="40"/>
+                <w:lang w:bidi="ml-IN"/>
+              </w:rPr>
+              <w:t>ÅprÉÉUÉåþWûÌiÉ</w:t>
+            </w:r>
+            <w:proofErr w:type="spellEnd"/>
+            <w:r>
+              <w:rPr>
+                <w:rFonts w:ascii="BRH Devanagari Extra" w:hAnsi="BRH Devanagari Extra" w:cs="BRH Devanagari Extra"/>
+                <w:color w:val="000000"/>
+                <w:sz w:val="40"/>
+                <w:szCs w:val="40"/>
+                <w:lang w:bidi="ml-IN"/>
+              </w:rPr>
+              <w:t xml:space="preserve"> | </w:t>
             </w:r>
           </w:p>
           <w:p>
@@ -4920,6 +5743,7 @@
               </w:rPr>
               <w:t>–</w:t>
             </w:r>
+            <w:proofErr w:type="spellStart"/>
             <w:r>
               <w:rPr>
                 <w:rFonts w:ascii="BRH Devanagari Extra" w:hAnsi="BRH Devanagari Extra" w:cs="BRH Devanagari Extra"/>
@@ -4941,6 +5765,7 @@
               </w:rPr>
               <w:t>ÌiÉ</w:t>
             </w:r>
+            <w:proofErr w:type="spellEnd"/>
             <w:r>
               <w:rPr>
                 <w:rFonts w:ascii="BRH Malayalam Extra" w:hAnsi="BRH Malayalam Extra" w:cs="BRH Devanagari Extra"/>
@@ -4961,7 +5786,29 @@
                 <w:szCs w:val="40"/>
                 <w:lang w:bidi="ml-IN"/>
               </w:rPr>
-              <w:t xml:space="preserve"> iÉxqÉÉÿiÉç |</w:t>
+              <w:t xml:space="preserve"> </w:t>
+            </w:r>
+            <w:proofErr w:type="spellStart"/>
+            <w:r>
+              <w:rPr>
+                <w:rFonts w:ascii="BRH Devanagari Extra" w:hAnsi="BRH Devanagari Extra" w:cs="BRH Devanagari Extra"/>
+                <w:color w:val="000000"/>
+                <w:sz w:val="40"/>
+                <w:szCs w:val="40"/>
+                <w:lang w:bidi="ml-IN"/>
+              </w:rPr>
+              <w:t>iÉxqÉÉÿiÉç</w:t>
+            </w:r>
+            <w:proofErr w:type="spellEnd"/>
+            <w:r>
+              <w:rPr>
+                <w:rFonts w:ascii="BRH Devanagari Extra" w:hAnsi="BRH Devanagari Extra" w:cs="BRH Devanagari Extra"/>
+                <w:color w:val="000000"/>
+                <w:sz w:val="40"/>
+                <w:szCs w:val="40"/>
+                <w:lang w:bidi="ml-IN"/>
+              </w:rPr>
+              <w:t xml:space="preserve"> |</w:t>
             </w:r>
           </w:p>
         </w:tc>
@@ -5094,16 +5941,51 @@
                 <w:szCs w:val="40"/>
               </w:rPr>
             </w:pPr>
-            <w:r>
-              <w:rPr>
-                <w:rFonts w:ascii="BRH Devanagari Extra" w:hAnsi="BRH Devanagari Extra" w:cs="BRH Devanagari Extra"/>
-                <w:color w:val="000000"/>
-                <w:sz w:val="40"/>
-                <w:szCs w:val="40"/>
-                <w:lang w:bidi="ml-IN"/>
-              </w:rPr>
-              <w:t xml:space="preserve">wÉQèû uÉæ | </w:t>
-            </w:r>
+            <w:proofErr w:type="spellStart"/>
+            <w:r>
+              <w:rPr>
+                <w:rFonts w:ascii="BRH Devanagari Extra" w:hAnsi="BRH Devanagari Extra" w:cs="BRH Devanagari Extra"/>
+                <w:color w:val="000000"/>
+                <w:sz w:val="40"/>
+                <w:szCs w:val="40"/>
+                <w:lang w:bidi="ml-IN"/>
+              </w:rPr>
+              <w:t>wÉQèû</w:t>
+            </w:r>
+            <w:proofErr w:type="spellEnd"/>
+            <w:r>
+              <w:rPr>
+                <w:rFonts w:ascii="BRH Devanagari Extra" w:hAnsi="BRH Devanagari Extra" w:cs="BRH Devanagari Extra"/>
+                <w:color w:val="000000"/>
+                <w:sz w:val="40"/>
+                <w:szCs w:val="40"/>
+                <w:lang w:bidi="ml-IN"/>
+              </w:rPr>
+              <w:t xml:space="preserve"> </w:t>
+            </w:r>
+            <w:proofErr w:type="spellStart"/>
+            <w:r>
+              <w:rPr>
+                <w:rFonts w:ascii="BRH Devanagari Extra" w:hAnsi="BRH Devanagari Extra" w:cs="BRH Devanagari Extra"/>
+                <w:color w:val="000000"/>
+                <w:sz w:val="40"/>
+                <w:szCs w:val="40"/>
+                <w:lang w:bidi="ml-IN"/>
+              </w:rPr>
+              <w:t>uÉæ</w:t>
+            </w:r>
+            <w:proofErr w:type="spellEnd"/>
+            <w:r>
+              <w:rPr>
+                <w:rFonts w:ascii="BRH Devanagari Extra" w:hAnsi="BRH Devanagari Extra" w:cs="BRH Devanagari Extra"/>
+                <w:color w:val="000000"/>
+                <w:sz w:val="40"/>
+                <w:szCs w:val="40"/>
+                <w:lang w:bidi="ml-IN"/>
+              </w:rPr>
+              <w:t xml:space="preserve"> | </w:t>
+            </w:r>
+            <w:proofErr w:type="spellStart"/>
             <w:r>
               <w:rPr>
                 <w:rFonts w:ascii="BRH Devanagari Extra" w:hAnsi="BRH Devanagari Extra" w:cs="BRH Devanagari Extra"/>
@@ -5115,6 +5997,7 @@
               </w:rPr>
               <w:t>uÉÉ</w:t>
             </w:r>
+            <w:proofErr w:type="spellEnd"/>
             <w:r>
               <w:rPr>
                 <w:rFonts w:ascii="BRH Malayalam Extra" w:hAnsi="BRH Malayalam Extra" w:cs="BRH Devanagari Extra"/>
@@ -5148,15 +6031,27 @@
               </w:rPr>
               <w:t>–</w:t>
             </w:r>
-            <w:r>
-              <w:rPr>
-                <w:rFonts w:ascii="BRH Devanagari Extra" w:hAnsi="BRH Devanagari Extra" w:cs="BRH Devanagari Extra"/>
-                <w:color w:val="000000"/>
-                <w:sz w:val="40"/>
-                <w:szCs w:val="40"/>
-                <w:lang w:bidi="ml-IN"/>
-              </w:rPr>
-              <w:t>iÉuÉþÈ |</w:t>
+            <w:proofErr w:type="spellStart"/>
+            <w:r>
+              <w:rPr>
+                <w:rFonts w:ascii="BRH Devanagari Extra" w:hAnsi="BRH Devanagari Extra" w:cs="BRH Devanagari Extra"/>
+                <w:color w:val="000000"/>
+                <w:sz w:val="40"/>
+                <w:szCs w:val="40"/>
+                <w:lang w:bidi="ml-IN"/>
+              </w:rPr>
+              <w:t>iÉuÉþÈ</w:t>
+            </w:r>
+            <w:proofErr w:type="spellEnd"/>
+            <w:r>
+              <w:rPr>
+                <w:rFonts w:ascii="BRH Devanagari Extra" w:hAnsi="BRH Devanagari Extra" w:cs="BRH Devanagari Extra"/>
+                <w:color w:val="000000"/>
+                <w:sz w:val="40"/>
+                <w:szCs w:val="40"/>
+                <w:lang w:bidi="ml-IN"/>
+              </w:rPr>
+              <w:t xml:space="preserve"> |</w:t>
             </w:r>
           </w:p>
         </w:tc>
@@ -5178,16 +6073,51 @@
                 <w:szCs w:val="40"/>
               </w:rPr>
             </w:pPr>
-            <w:r>
-              <w:rPr>
-                <w:rFonts w:ascii="BRH Devanagari Extra" w:hAnsi="BRH Devanagari Extra" w:cs="BRH Devanagari Extra"/>
-                <w:color w:val="000000"/>
-                <w:sz w:val="40"/>
-                <w:szCs w:val="40"/>
-                <w:lang w:bidi="ml-IN"/>
-              </w:rPr>
-              <w:t xml:space="preserve">wÉQèû uÉæ | </w:t>
-            </w:r>
+            <w:proofErr w:type="spellStart"/>
+            <w:r>
+              <w:rPr>
+                <w:rFonts w:ascii="BRH Devanagari Extra" w:hAnsi="BRH Devanagari Extra" w:cs="BRH Devanagari Extra"/>
+                <w:color w:val="000000"/>
+                <w:sz w:val="40"/>
+                <w:szCs w:val="40"/>
+                <w:lang w:bidi="ml-IN"/>
+              </w:rPr>
+              <w:t>wÉQèû</w:t>
+            </w:r>
+            <w:proofErr w:type="spellEnd"/>
+            <w:r>
+              <w:rPr>
+                <w:rFonts w:ascii="BRH Devanagari Extra" w:hAnsi="BRH Devanagari Extra" w:cs="BRH Devanagari Extra"/>
+                <w:color w:val="000000"/>
+                <w:sz w:val="40"/>
+                <w:szCs w:val="40"/>
+                <w:lang w:bidi="ml-IN"/>
+              </w:rPr>
+              <w:t xml:space="preserve"> </w:t>
+            </w:r>
+            <w:proofErr w:type="spellStart"/>
+            <w:r>
+              <w:rPr>
+                <w:rFonts w:ascii="BRH Devanagari Extra" w:hAnsi="BRH Devanagari Extra" w:cs="BRH Devanagari Extra"/>
+                <w:color w:val="000000"/>
+                <w:sz w:val="40"/>
+                <w:szCs w:val="40"/>
+                <w:lang w:bidi="ml-IN"/>
+              </w:rPr>
+              <w:t>uÉæ</w:t>
+            </w:r>
+            <w:proofErr w:type="spellEnd"/>
+            <w:r>
+              <w:rPr>
+                <w:rFonts w:ascii="BRH Devanagari Extra" w:hAnsi="BRH Devanagari Extra" w:cs="BRH Devanagari Extra"/>
+                <w:color w:val="000000"/>
+                <w:sz w:val="40"/>
+                <w:szCs w:val="40"/>
+                <w:lang w:bidi="ml-IN"/>
+              </w:rPr>
+              <w:t xml:space="preserve"> | </w:t>
+            </w:r>
+            <w:proofErr w:type="spellStart"/>
             <w:r>
               <w:rPr>
                 <w:rFonts w:ascii="BRH Devanagari Extra" w:hAnsi="BRH Devanagari Extra" w:cs="BRH Devanagari Extra"/>
@@ -5199,6 +6129,7 @@
               </w:rPr>
               <w:t>uÉÉ</w:t>
             </w:r>
+            <w:proofErr w:type="spellEnd"/>
             <w:r>
               <w:rPr>
                 <w:rFonts w:ascii="BRH Devanagari Extra" w:hAnsi="BRH Devanagari Extra" w:cs="BRH Devanagari Extra"/>
@@ -5220,15 +6151,27 @@
               </w:rPr>
               <w:t>–</w:t>
             </w:r>
-            <w:r>
-              <w:rPr>
-                <w:rFonts w:ascii="BRH Devanagari Extra" w:hAnsi="BRH Devanagari Extra" w:cs="BRH Devanagari Extra"/>
-                <w:color w:val="000000"/>
-                <w:sz w:val="40"/>
-                <w:szCs w:val="40"/>
-                <w:lang w:bidi="ml-IN"/>
-              </w:rPr>
-              <w:t>iÉuÉþÈ |</w:t>
+            <w:proofErr w:type="spellStart"/>
+            <w:r>
+              <w:rPr>
+                <w:rFonts w:ascii="BRH Devanagari Extra" w:hAnsi="BRH Devanagari Extra" w:cs="BRH Devanagari Extra"/>
+                <w:color w:val="000000"/>
+                <w:sz w:val="40"/>
+                <w:szCs w:val="40"/>
+                <w:lang w:bidi="ml-IN"/>
+              </w:rPr>
+              <w:t>iÉuÉþÈ</w:t>
+            </w:r>
+            <w:proofErr w:type="spellEnd"/>
+            <w:r>
+              <w:rPr>
+                <w:rFonts w:ascii="BRH Devanagari Extra" w:hAnsi="BRH Devanagari Extra" w:cs="BRH Devanagari Extra"/>
+                <w:color w:val="000000"/>
+                <w:sz w:val="40"/>
+                <w:szCs w:val="40"/>
+                <w:lang w:bidi="ml-IN"/>
+              </w:rPr>
+              <w:t xml:space="preserve"> |</w:t>
             </w:r>
           </w:p>
         </w:tc>
@@ -5362,14 +6305,45 @@
                 <w:lang w:val="en-IN" w:eastAsia="en-IN" w:bidi="ml-IN"/>
               </w:rPr>
             </w:pPr>
-            <w:r>
-              <w:rPr>
-                <w:rFonts w:ascii="BRH Devanagari Extra" w:hAnsi="BRH Devanagari Extra" w:cs="BRH Devanagari Extra"/>
-                <w:sz w:val="40"/>
-                <w:szCs w:val="40"/>
-                <w:lang w:bidi="ml-IN"/>
-              </w:rPr>
-              <w:t>ÌlÉUç. WûþhrÉÉiÉç | Wû</w:t>
+            <w:proofErr w:type="spellStart"/>
+            <w:r>
+              <w:rPr>
+                <w:rFonts w:ascii="BRH Devanagari Extra" w:hAnsi="BRH Devanagari Extra" w:cs="BRH Devanagari Extra"/>
+                <w:sz w:val="40"/>
+                <w:szCs w:val="40"/>
+                <w:lang w:bidi="ml-IN"/>
+              </w:rPr>
+              <w:t>ÌlÉUç</w:t>
+            </w:r>
+            <w:proofErr w:type="spellEnd"/>
+            <w:r>
+              <w:rPr>
+                <w:rFonts w:ascii="BRH Devanagari Extra" w:hAnsi="BRH Devanagari Extra" w:cs="BRH Devanagari Extra"/>
+                <w:sz w:val="40"/>
+                <w:szCs w:val="40"/>
+                <w:lang w:bidi="ml-IN"/>
+              </w:rPr>
+              <w:t xml:space="preserve">. </w:t>
+            </w:r>
+            <w:proofErr w:type="spellStart"/>
+            <w:r>
+              <w:rPr>
+                <w:rFonts w:ascii="BRH Devanagari Extra" w:hAnsi="BRH Devanagari Extra" w:cs="BRH Devanagari Extra"/>
+                <w:sz w:val="40"/>
+                <w:szCs w:val="40"/>
+                <w:lang w:bidi="ml-IN"/>
+              </w:rPr>
+              <w:t>WûþhrÉÉiÉç</w:t>
+            </w:r>
+            <w:proofErr w:type="spellEnd"/>
+            <w:r>
+              <w:rPr>
+                <w:rFonts w:ascii="BRH Devanagari Extra" w:hAnsi="BRH Devanagari Extra" w:cs="BRH Devanagari Extra"/>
+                <w:sz w:val="40"/>
+                <w:szCs w:val="40"/>
+                <w:lang w:bidi="ml-IN"/>
+              </w:rPr>
+              <w:t xml:space="preserve"> | Wû</w:t>
             </w:r>
             <w:r>
               <w:rPr>
@@ -5381,6 +6355,7 @@
               </w:rPr>
               <w:t>–</w:t>
             </w:r>
+            <w:proofErr w:type="spellStart"/>
             <w:r>
               <w:rPr>
                 <w:rFonts w:ascii="BRH Devanagari Extra" w:hAnsi="BRH Devanagari Extra" w:cs="BRH Devanagari Extra"/>
@@ -5391,6 +6366,7 @@
               </w:rPr>
               <w:t>lrÉÉ</w:t>
             </w:r>
+            <w:proofErr w:type="spellEnd"/>
             <w:r>
               <w:rPr>
                 <w:rFonts w:ascii="BRH Malayalam Extra" w:hAnsi="BRH Malayalam Extra" w:cs="BRH Devanagari Extra"/>
@@ -5409,7 +6385,27 @@
                 <w:szCs w:val="40"/>
                 <w:lang w:bidi="ml-IN"/>
               </w:rPr>
-              <w:t>jÉç wÉQÒûþ±ÉqÉqÉç |</w:t>
+              <w:t xml:space="preserve">jÉç </w:t>
+            </w:r>
+            <w:proofErr w:type="spellStart"/>
+            <w:r>
+              <w:rPr>
+                <w:rFonts w:ascii="BRH Devanagari Extra" w:hAnsi="BRH Devanagari Extra" w:cs="BRH Devanagari Extra"/>
+                <w:sz w:val="40"/>
+                <w:szCs w:val="40"/>
+                <w:lang w:bidi="ml-IN"/>
+              </w:rPr>
+              <w:t>wÉQÒûþ±ÉqÉqÉç</w:t>
+            </w:r>
+            <w:proofErr w:type="spellEnd"/>
+            <w:r>
+              <w:rPr>
+                <w:rFonts w:ascii="BRH Devanagari Extra" w:hAnsi="BRH Devanagari Extra" w:cs="BRH Devanagari Extra"/>
+                <w:sz w:val="40"/>
+                <w:szCs w:val="40"/>
+                <w:lang w:bidi="ml-IN"/>
+              </w:rPr>
+              <w:t xml:space="preserve"> |</w:t>
             </w:r>
           </w:p>
         </w:tc>
@@ -5432,14 +6428,45 @@
                 <w:lang w:val="en-IN" w:eastAsia="en-IN" w:bidi="ml-IN"/>
               </w:rPr>
             </w:pPr>
-            <w:r>
-              <w:rPr>
-                <w:rFonts w:ascii="BRH Devanagari Extra" w:hAnsi="BRH Devanagari Extra" w:cs="BRH Devanagari Extra"/>
-                <w:sz w:val="40"/>
-                <w:szCs w:val="40"/>
-                <w:lang w:bidi="ml-IN"/>
-              </w:rPr>
-              <w:t>ÌlÉUç. WûþhrÉÉiÉç | Wû</w:t>
+            <w:proofErr w:type="spellStart"/>
+            <w:r>
+              <w:rPr>
+                <w:rFonts w:ascii="BRH Devanagari Extra" w:hAnsi="BRH Devanagari Extra" w:cs="BRH Devanagari Extra"/>
+                <w:sz w:val="40"/>
+                <w:szCs w:val="40"/>
+                <w:lang w:bidi="ml-IN"/>
+              </w:rPr>
+              <w:t>ÌlÉUç</w:t>
+            </w:r>
+            <w:proofErr w:type="spellEnd"/>
+            <w:r>
+              <w:rPr>
+                <w:rFonts w:ascii="BRH Devanagari Extra" w:hAnsi="BRH Devanagari Extra" w:cs="BRH Devanagari Extra"/>
+                <w:sz w:val="40"/>
+                <w:szCs w:val="40"/>
+                <w:lang w:bidi="ml-IN"/>
+              </w:rPr>
+              <w:t xml:space="preserve">. </w:t>
+            </w:r>
+            <w:proofErr w:type="spellStart"/>
+            <w:r>
+              <w:rPr>
+                <w:rFonts w:ascii="BRH Devanagari Extra" w:hAnsi="BRH Devanagari Extra" w:cs="BRH Devanagari Extra"/>
+                <w:sz w:val="40"/>
+                <w:szCs w:val="40"/>
+                <w:lang w:bidi="ml-IN"/>
+              </w:rPr>
+              <w:t>WûþhrÉÉiÉç</w:t>
+            </w:r>
+            <w:proofErr w:type="spellEnd"/>
+            <w:r>
+              <w:rPr>
+                <w:rFonts w:ascii="BRH Devanagari Extra" w:hAnsi="BRH Devanagari Extra" w:cs="BRH Devanagari Extra"/>
+                <w:sz w:val="40"/>
+                <w:szCs w:val="40"/>
+                <w:lang w:bidi="ml-IN"/>
+              </w:rPr>
+              <w:t xml:space="preserve"> | Wû</w:t>
             </w:r>
             <w:r>
               <w:rPr>
@@ -5452,6 +6479,7 @@
               </w:rPr>
               <w:t>–</w:t>
             </w:r>
+            <w:proofErr w:type="spellStart"/>
             <w:r>
               <w:rPr>
                 <w:rFonts w:ascii="BRH Devanagari Extra" w:hAnsi="BRH Devanagari Extra" w:cs="BRH Devanagari Extra"/>
@@ -5462,6 +6490,7 @@
               </w:rPr>
               <w:t>hrÉÉ</w:t>
             </w:r>
+            <w:proofErr w:type="spellEnd"/>
             <w:r>
               <w:rPr>
                 <w:rFonts w:ascii="BRH Malayalam Extra" w:hAnsi="BRH Malayalam Extra" w:cs="BRH Devanagari Extra"/>
@@ -5479,7 +6508,27 @@
                 <w:szCs w:val="40"/>
                 <w:lang w:bidi="ml-IN"/>
               </w:rPr>
-              <w:t>jÉç wÉQÒûþ±ÉqÉqÉç |</w:t>
+              <w:t xml:space="preserve">jÉç </w:t>
+            </w:r>
+            <w:proofErr w:type="spellStart"/>
+            <w:r>
+              <w:rPr>
+                <w:rFonts w:ascii="BRH Devanagari Extra" w:hAnsi="BRH Devanagari Extra" w:cs="BRH Devanagari Extra"/>
+                <w:sz w:val="40"/>
+                <w:szCs w:val="40"/>
+                <w:lang w:bidi="ml-IN"/>
+              </w:rPr>
+              <w:t>wÉQÒûþ±ÉqÉqÉç</w:t>
+            </w:r>
+            <w:proofErr w:type="spellEnd"/>
+            <w:r>
+              <w:rPr>
+                <w:rFonts w:ascii="BRH Devanagari Extra" w:hAnsi="BRH Devanagari Extra" w:cs="BRH Devanagari Extra"/>
+                <w:sz w:val="40"/>
+                <w:szCs w:val="40"/>
+                <w:lang w:bidi="ml-IN"/>
+              </w:rPr>
+              <w:t xml:space="preserve"> |</w:t>
             </w:r>
           </w:p>
         </w:tc>
@@ -5633,6 +6682,7 @@
               </w:rPr>
               <w:t>–</w:t>
             </w:r>
+            <w:proofErr w:type="spellStart"/>
             <w:r>
               <w:rPr>
                 <w:rFonts w:ascii="BRH Devanagari Extra" w:hAnsi="BRH Devanagari Extra" w:cs="BRH Devanagari Extra"/>
@@ -5643,6 +6693,7 @@
               </w:rPr>
               <w:t>YrÉÉ</w:t>
             </w:r>
+            <w:proofErr w:type="spellEnd"/>
             <w:r>
               <w:rPr>
                 <w:rFonts w:ascii="BRH Malayalam Extra" w:hAnsi="BRH Malayalam Extra" w:cs="BRH Devanagari Extra"/>
@@ -5654,15 +6705,27 @@
               </w:rPr>
               <w:t>–</w:t>
             </w:r>
-            <w:r>
-              <w:rPr>
-                <w:rFonts w:ascii="BRH Devanagari Extra" w:hAnsi="BRH Devanagari Extra" w:cs="BRH Devanagari Extra"/>
-                <w:color w:val="000000"/>
-                <w:sz w:val="40"/>
-                <w:szCs w:val="40"/>
-                <w:lang w:bidi="ml-IN"/>
-              </w:rPr>
-              <w:t>lÉqÉÌ¨Éþ | A</w:t>
+            <w:proofErr w:type="spellStart"/>
+            <w:r>
+              <w:rPr>
+                <w:rFonts w:ascii="BRH Devanagari Extra" w:hAnsi="BRH Devanagari Extra" w:cs="BRH Devanagari Extra"/>
+                <w:color w:val="000000"/>
+                <w:sz w:val="40"/>
+                <w:szCs w:val="40"/>
+                <w:lang w:bidi="ml-IN"/>
+              </w:rPr>
+              <w:t>lÉqÉÌ¨Éþ</w:t>
+            </w:r>
+            <w:proofErr w:type="spellEnd"/>
+            <w:r>
+              <w:rPr>
+                <w:rFonts w:ascii="BRH Devanagari Extra" w:hAnsi="BRH Devanagari Extra" w:cs="BRH Devanagari Extra"/>
+                <w:color w:val="000000"/>
+                <w:sz w:val="40"/>
+                <w:szCs w:val="40"/>
+                <w:lang w:bidi="ml-IN"/>
+              </w:rPr>
+              <w:t xml:space="preserve"> | A</w:t>
             </w:r>
             <w:r>
               <w:rPr>
@@ -5726,6 +6789,7 @@
               </w:rPr>
               <w:t>–</w:t>
             </w:r>
+            <w:proofErr w:type="spellStart"/>
             <w:r>
               <w:rPr>
                 <w:rFonts w:ascii="BRH Devanagari Extra" w:hAnsi="BRH Devanagari Extra" w:cs="BRH Devanagari Extra"/>
@@ -5736,6 +6800,7 @@
               </w:rPr>
               <w:t>YrÉÉ</w:t>
             </w:r>
+            <w:proofErr w:type="spellEnd"/>
             <w:r>
               <w:rPr>
                 <w:rFonts w:ascii="BRH Malayalam Extra" w:hAnsi="BRH Malayalam Extra" w:cs="BRH Devanagari Extra"/>
@@ -5747,15 +6812,27 @@
               </w:rPr>
               <w:t>–</w:t>
             </w:r>
-            <w:r>
-              <w:rPr>
-                <w:rFonts w:ascii="BRH Devanagari Extra" w:hAnsi="BRH Devanagari Extra" w:cs="BRH Devanagari Extra"/>
-                <w:color w:val="000000"/>
-                <w:sz w:val="40"/>
-                <w:szCs w:val="40"/>
-                <w:lang w:bidi="ml-IN"/>
-              </w:rPr>
-              <w:t>lÉqÉÌ¨Éþ | A</w:t>
+            <w:proofErr w:type="spellStart"/>
+            <w:r>
+              <w:rPr>
+                <w:rFonts w:ascii="BRH Devanagari Extra" w:hAnsi="BRH Devanagari Extra" w:cs="BRH Devanagari Extra"/>
+                <w:color w:val="000000"/>
+                <w:sz w:val="40"/>
+                <w:szCs w:val="40"/>
+                <w:lang w:bidi="ml-IN"/>
+              </w:rPr>
+              <w:t>lÉqÉÌ¨Éþ</w:t>
+            </w:r>
+            <w:proofErr w:type="spellEnd"/>
+            <w:r>
+              <w:rPr>
+                <w:rFonts w:ascii="BRH Devanagari Extra" w:hAnsi="BRH Devanagari Extra" w:cs="BRH Devanagari Extra"/>
+                <w:color w:val="000000"/>
+                <w:sz w:val="40"/>
+                <w:szCs w:val="40"/>
+                <w:lang w:bidi="ml-IN"/>
+              </w:rPr>
+              <w:t xml:space="preserve"> | A</w:t>
             </w:r>
             <w:r>
               <w:rPr>
@@ -5921,6 +6998,7 @@
                 <w:lang w:val="en-IN" w:eastAsia="en-IN" w:bidi="ml-IN"/>
               </w:rPr>
             </w:pPr>
+            <w:proofErr w:type="spellStart"/>
             <w:r>
               <w:rPr>
                 <w:rFonts w:ascii="BRH Devanagari Extra" w:hAnsi="BRH Devanagari Extra" w:cs="BRH Devanagari Extra"/>
@@ -5931,6 +7009,7 @@
               </w:rPr>
               <w:t>zrÉå</w:t>
             </w:r>
+            <w:proofErr w:type="spellEnd"/>
             <w:r>
               <w:rPr>
                 <w:rFonts w:ascii="BRH Malayalam Extra" w:hAnsi="BRH Malayalam Extra" w:cs="BRH Devanagari Extra"/>
@@ -5942,6 +7021,7 @@
               </w:rPr>
               <w:t>–</w:t>
             </w:r>
+            <w:proofErr w:type="spellStart"/>
             <w:r>
               <w:rPr>
                 <w:rFonts w:ascii="BRH Devanagari Extra" w:hAnsi="BRH Devanagari Extra" w:cs="BRH Devanagari Extra"/>
@@ -5952,6 +7032,7 @@
               </w:rPr>
               <w:t>iÉÉ</w:t>
             </w:r>
+            <w:proofErr w:type="spellEnd"/>
             <w:r>
               <w:rPr>
                 <w:rFonts w:ascii="BRH Malayalam Extra" w:hAnsi="BRH Malayalam Extra" w:cs="BRH Devanagari Extra"/>
@@ -5971,8 +7052,31 @@
                 <w:szCs w:val="40"/>
                 <w:lang w:bidi="ml-IN"/>
               </w:rPr>
-              <w:t xml:space="preserve">¤É CÌiÉþ </w:t>
-            </w:r>
+              <w:t xml:space="preserve">¤É </w:t>
+            </w:r>
+            <w:proofErr w:type="spellStart"/>
+            <w:r>
+              <w:rPr>
+                <w:rFonts w:ascii="BRH Devanagari Extra" w:hAnsi="BRH Devanagari Extra" w:cs="BRH Devanagari Extra"/>
+                <w:color w:val="000000"/>
+                <w:sz w:val="40"/>
+                <w:szCs w:val="40"/>
+                <w:lang w:bidi="ml-IN"/>
+              </w:rPr>
+              <w:t>CÌiÉþ</w:t>
+            </w:r>
+            <w:proofErr w:type="spellEnd"/>
+            <w:r>
+              <w:rPr>
+                <w:rFonts w:ascii="BRH Devanagari Extra" w:hAnsi="BRH Devanagari Extra" w:cs="BRH Devanagari Extra"/>
+                <w:color w:val="000000"/>
+                <w:sz w:val="40"/>
+                <w:szCs w:val="40"/>
+                <w:lang w:bidi="ml-IN"/>
+              </w:rPr>
+              <w:t xml:space="preserve"> </w:t>
+            </w:r>
+            <w:proofErr w:type="spellStart"/>
             <w:r>
               <w:rPr>
                 <w:rFonts w:ascii="BRH Devanagari Extra" w:hAnsi="BRH Devanagari Extra" w:cs="BRH Devanagari Extra"/>
@@ -5992,7 +7096,18 @@
                 <w:szCs w:val="40"/>
                 <w:lang w:bidi="ml-IN"/>
               </w:rPr>
-              <w:t>åiÉ - A</w:t>
+              <w:t>åiÉ</w:t>
+            </w:r>
+            <w:proofErr w:type="spellEnd"/>
+            <w:r>
+              <w:rPr>
+                <w:rFonts w:ascii="BRH Devanagari Extra" w:hAnsi="BRH Devanagari Extra" w:cs="BRH Devanagari Extra"/>
+                <w:color w:val="000000"/>
+                <w:sz w:val="40"/>
+                <w:szCs w:val="40"/>
+                <w:lang w:bidi="ml-IN"/>
+              </w:rPr>
+              <w:t xml:space="preserve"> - A</w:t>
             </w:r>
             <w:r>
               <w:rPr>
@@ -6036,6 +7151,7 @@
                 <w:lang w:val="en-IN" w:eastAsia="en-IN" w:bidi="ml-IN"/>
               </w:rPr>
             </w:pPr>
+            <w:proofErr w:type="spellStart"/>
             <w:r>
               <w:rPr>
                 <w:rFonts w:ascii="BRH Devanagari Extra" w:hAnsi="BRH Devanagari Extra" w:cs="BRH Devanagari Extra"/>
@@ -6046,6 +7162,7 @@
               </w:rPr>
               <w:t>zrÉå</w:t>
             </w:r>
+            <w:proofErr w:type="spellEnd"/>
             <w:r>
               <w:rPr>
                 <w:rFonts w:ascii="BRH Malayalam Extra" w:hAnsi="BRH Malayalam Extra" w:cs="BRH Devanagari Extra"/>
@@ -6057,6 +7174,7 @@
               </w:rPr>
               <w:t>–</w:t>
             </w:r>
+            <w:proofErr w:type="spellStart"/>
             <w:r>
               <w:rPr>
                 <w:rFonts w:ascii="BRH Devanagari Extra" w:hAnsi="BRH Devanagari Extra" w:cs="BRH Devanagari Extra"/>
@@ -6067,6 +7185,7 @@
               </w:rPr>
               <w:t>iÉÉ</w:t>
             </w:r>
+            <w:proofErr w:type="spellEnd"/>
             <w:r>
               <w:rPr>
                 <w:rFonts w:ascii="BRH Malayalam Extra" w:hAnsi="BRH Malayalam Extra" w:cs="BRH Devanagari Extra"/>
@@ -6086,8 +7205,31 @@
                 <w:szCs w:val="40"/>
                 <w:lang w:bidi="ml-IN"/>
               </w:rPr>
-              <w:t xml:space="preserve">¤É CÌiÉþ </w:t>
-            </w:r>
+              <w:t xml:space="preserve">¤É </w:t>
+            </w:r>
+            <w:proofErr w:type="spellStart"/>
+            <w:r>
+              <w:rPr>
+                <w:rFonts w:ascii="BRH Devanagari Extra" w:hAnsi="BRH Devanagari Extra" w:cs="BRH Devanagari Extra"/>
+                <w:color w:val="000000"/>
+                <w:sz w:val="40"/>
+                <w:szCs w:val="40"/>
+                <w:lang w:bidi="ml-IN"/>
+              </w:rPr>
+              <w:t>CÌiÉþ</w:t>
+            </w:r>
+            <w:proofErr w:type="spellEnd"/>
+            <w:r>
+              <w:rPr>
+                <w:rFonts w:ascii="BRH Devanagari Extra" w:hAnsi="BRH Devanagari Extra" w:cs="BRH Devanagari Extra"/>
+                <w:color w:val="000000"/>
+                <w:sz w:val="40"/>
+                <w:szCs w:val="40"/>
+                <w:lang w:bidi="ml-IN"/>
+              </w:rPr>
+              <w:t xml:space="preserve"> </w:t>
+            </w:r>
+            <w:proofErr w:type="spellStart"/>
             <w:r>
               <w:rPr>
                 <w:rFonts w:ascii="BRH Devanagari Extra" w:hAnsi="BRH Devanagari Extra" w:cs="BRH Devanagari Extra"/>
@@ -6107,7 +7249,18 @@
                 <w:szCs w:val="40"/>
                 <w:lang w:bidi="ml-IN"/>
               </w:rPr>
-              <w:t>åiÉ - A</w:t>
+              <w:t>åiÉ</w:t>
+            </w:r>
+            <w:proofErr w:type="spellEnd"/>
+            <w:r>
+              <w:rPr>
+                <w:rFonts w:ascii="BRH Devanagari Extra" w:hAnsi="BRH Devanagari Extra" w:cs="BRH Devanagari Extra"/>
+                <w:color w:val="000000"/>
+                <w:sz w:val="40"/>
+                <w:szCs w:val="40"/>
+                <w:lang w:bidi="ml-IN"/>
+              </w:rPr>
+              <w:t xml:space="preserve"> - A</w:t>
             </w:r>
             <w:r>
               <w:rPr>
@@ -6262,6 +7415,7 @@
                 <w:lang w:val="en-IN" w:eastAsia="en-IN" w:bidi="ml-IN"/>
               </w:rPr>
             </w:pPr>
+            <w:proofErr w:type="spellStart"/>
             <w:r>
               <w:rPr>
                 <w:rFonts w:ascii="BRH Devanagari Extra" w:hAnsi="BRH Devanagari Extra" w:cs="BRH Devanagari Extra"/>
@@ -6272,6 +7426,7 @@
               </w:rPr>
               <w:t>ÍzÉ</w:t>
             </w:r>
+            <w:proofErr w:type="spellEnd"/>
             <w:r>
               <w:rPr>
                 <w:rFonts w:ascii="BRH Malayalam Extra" w:hAnsi="BRH Malayalam Extra" w:cs="BRH Devanagari Extra"/>
@@ -6283,6 +7438,7 @@
               </w:rPr>
               <w:t>–</w:t>
             </w:r>
+            <w:proofErr w:type="spellStart"/>
             <w:r>
               <w:rPr>
                 <w:rFonts w:ascii="BRH Devanagari Extra" w:hAnsi="BRH Devanagari Extra" w:cs="BRH Devanagari Extra"/>
@@ -6293,6 +7449,7 @@
               </w:rPr>
               <w:t>ÌiÉ</w:t>
             </w:r>
+            <w:proofErr w:type="spellEnd"/>
             <w:r>
               <w:rPr>
                 <w:rFonts w:ascii="BRH Malayalam Extra" w:hAnsi="BRH Malayalam Extra" w:cs="BRH Devanagari Extra"/>
@@ -6304,6 +7461,7 @@
               </w:rPr>
               <w:t>–</w:t>
             </w:r>
+            <w:proofErr w:type="spellStart"/>
             <w:r>
               <w:rPr>
                 <w:rFonts w:ascii="BRH Devanagari Extra" w:hAnsi="BRH Devanagari Extra" w:cs="BRH Devanagari Extra"/>
@@ -6325,15 +7483,82 @@
               </w:rPr>
               <w:t>lkÉë</w:t>
             </w:r>
-            <w:r>
-              <w:rPr>
-                <w:rFonts w:ascii="BRH Devanagari Extra" w:hAnsi="BRH Devanagari Extra" w:cs="BRH Devanagari Extra"/>
-                <w:color w:val="000000"/>
-                <w:sz w:val="40"/>
-                <w:szCs w:val="40"/>
-                <w:lang w:bidi="ml-IN"/>
-              </w:rPr>
-              <w:t xml:space="preserve"> CÌiÉþ ÍzÉÌiÉ - UlkÉëþÈ | </w:t>
+            <w:proofErr w:type="spellEnd"/>
+            <w:r>
+              <w:rPr>
+                <w:rFonts w:ascii="BRH Devanagari Extra" w:hAnsi="BRH Devanagari Extra" w:cs="BRH Devanagari Extra"/>
+                <w:color w:val="000000"/>
+                <w:sz w:val="40"/>
+                <w:szCs w:val="40"/>
+                <w:lang w:bidi="ml-IN"/>
+              </w:rPr>
+              <w:t xml:space="preserve"> </w:t>
+            </w:r>
+            <w:proofErr w:type="spellStart"/>
+            <w:r>
+              <w:rPr>
+                <w:rFonts w:ascii="BRH Devanagari Extra" w:hAnsi="BRH Devanagari Extra" w:cs="BRH Devanagari Extra"/>
+                <w:color w:val="000000"/>
+                <w:sz w:val="40"/>
+                <w:szCs w:val="40"/>
+                <w:lang w:bidi="ml-IN"/>
+              </w:rPr>
+              <w:t>CÌiÉþ</w:t>
+            </w:r>
+            <w:proofErr w:type="spellEnd"/>
+            <w:r>
+              <w:rPr>
+                <w:rFonts w:ascii="BRH Devanagari Extra" w:hAnsi="BRH Devanagari Extra" w:cs="BRH Devanagari Extra"/>
+                <w:color w:val="000000"/>
+                <w:sz w:val="40"/>
+                <w:szCs w:val="40"/>
+                <w:lang w:bidi="ml-IN"/>
+              </w:rPr>
+              <w:t xml:space="preserve"> </w:t>
+            </w:r>
+            <w:proofErr w:type="spellStart"/>
+            <w:r>
+              <w:rPr>
+                <w:rFonts w:ascii="BRH Devanagari Extra" w:hAnsi="BRH Devanagari Extra" w:cs="BRH Devanagari Extra"/>
+                <w:color w:val="000000"/>
+                <w:sz w:val="40"/>
+                <w:szCs w:val="40"/>
+                <w:lang w:bidi="ml-IN"/>
+              </w:rPr>
+              <w:t>ÍzÉÌiÉ</w:t>
+            </w:r>
+            <w:proofErr w:type="spellEnd"/>
+            <w:r>
+              <w:rPr>
+                <w:rFonts w:ascii="BRH Devanagari Extra" w:hAnsi="BRH Devanagari Extra" w:cs="BRH Devanagari Extra"/>
+                <w:color w:val="000000"/>
+                <w:sz w:val="40"/>
+                <w:szCs w:val="40"/>
+                <w:lang w:bidi="ml-IN"/>
+              </w:rPr>
+              <w:t xml:space="preserve"> - </w:t>
+            </w:r>
+            <w:proofErr w:type="spellStart"/>
+            <w:r>
+              <w:rPr>
+                <w:rFonts w:ascii="BRH Devanagari Extra" w:hAnsi="BRH Devanagari Extra" w:cs="BRH Devanagari Extra"/>
+                <w:color w:val="000000"/>
+                <w:sz w:val="40"/>
+                <w:szCs w:val="40"/>
+                <w:lang w:bidi="ml-IN"/>
+              </w:rPr>
+              <w:t>UlkÉëþÈ</w:t>
+            </w:r>
+            <w:proofErr w:type="spellEnd"/>
+            <w:r>
+              <w:rPr>
+                <w:rFonts w:ascii="BRH Devanagari Extra" w:hAnsi="BRH Devanagari Extra" w:cs="BRH Devanagari Extra"/>
+                <w:color w:val="000000"/>
+                <w:sz w:val="40"/>
+                <w:szCs w:val="40"/>
+                <w:lang w:bidi="ml-IN"/>
+              </w:rPr>
+              <w:t xml:space="preserve"> | </w:t>
             </w:r>
           </w:p>
         </w:tc>
@@ -6356,6 +7581,7 @@
                 <w:lang w:val="en-IN" w:eastAsia="en-IN" w:bidi="ml-IN"/>
               </w:rPr>
             </w:pPr>
+            <w:proofErr w:type="spellStart"/>
             <w:r>
               <w:rPr>
                 <w:rFonts w:ascii="BRH Devanagari Extra" w:hAnsi="BRH Devanagari Extra" w:cs="BRH Devanagari Extra"/>
@@ -6366,6 +7592,7 @@
               </w:rPr>
               <w:t>ÍzÉ</w:t>
             </w:r>
+            <w:proofErr w:type="spellEnd"/>
             <w:r>
               <w:rPr>
                 <w:rFonts w:ascii="BRH Malayalam Extra" w:hAnsi="BRH Malayalam Extra" w:cs="BRH Devanagari Extra"/>
@@ -6377,6 +7604,7 @@
               </w:rPr>
               <w:t>–</w:t>
             </w:r>
+            <w:proofErr w:type="spellStart"/>
             <w:r>
               <w:rPr>
                 <w:rFonts w:ascii="BRH Devanagari Extra" w:hAnsi="BRH Devanagari Extra" w:cs="BRH Devanagari Extra"/>
@@ -6387,6 +7615,7 @@
               </w:rPr>
               <w:t>ÌiÉ</w:t>
             </w:r>
+            <w:proofErr w:type="spellEnd"/>
             <w:r>
               <w:rPr>
                 <w:rFonts w:ascii="BRH Malayalam Extra" w:hAnsi="BRH Malayalam Extra" w:cs="BRH Devanagari Extra"/>
@@ -6398,6 +7627,7 @@
               </w:rPr>
               <w:t>–</w:t>
             </w:r>
+            <w:proofErr w:type="spellStart"/>
             <w:r>
               <w:rPr>
                 <w:rFonts w:ascii="BRH Devanagari Extra" w:hAnsi="BRH Devanagari Extra" w:cs="BRH Devanagari Extra"/>
@@ -6419,6 +7649,7 @@
               </w:rPr>
               <w:t>lkÉ</w:t>
             </w:r>
+            <w:proofErr w:type="spellEnd"/>
             <w:r>
               <w:rPr>
                 <w:rFonts w:ascii="BRH Malayalam Extra" w:hAnsi="BRH Malayalam Extra" w:cs="BRH Devanagari Extra"/>
@@ -6438,7 +7669,73 @@
                 <w:szCs w:val="40"/>
                 <w:lang w:bidi="ml-IN"/>
               </w:rPr>
-              <w:t>ë CÌiÉþ ÍzÉÌiÉ - UlkÉëþÈ |</w:t>
+              <w:t xml:space="preserve">ë </w:t>
+            </w:r>
+            <w:proofErr w:type="spellStart"/>
+            <w:r>
+              <w:rPr>
+                <w:rFonts w:ascii="BRH Devanagari Extra" w:hAnsi="BRH Devanagari Extra" w:cs="BRH Devanagari Extra"/>
+                <w:color w:val="000000"/>
+                <w:sz w:val="40"/>
+                <w:szCs w:val="40"/>
+                <w:lang w:bidi="ml-IN"/>
+              </w:rPr>
+              <w:t>CÌiÉþ</w:t>
+            </w:r>
+            <w:proofErr w:type="spellEnd"/>
+            <w:r>
+              <w:rPr>
+                <w:rFonts w:ascii="BRH Devanagari Extra" w:hAnsi="BRH Devanagari Extra" w:cs="BRH Devanagari Extra"/>
+                <w:color w:val="000000"/>
+                <w:sz w:val="40"/>
+                <w:szCs w:val="40"/>
+                <w:lang w:bidi="ml-IN"/>
+              </w:rPr>
+              <w:t xml:space="preserve"> </w:t>
+            </w:r>
+            <w:proofErr w:type="spellStart"/>
+            <w:r>
+              <w:rPr>
+                <w:rFonts w:ascii="BRH Devanagari Extra" w:hAnsi="BRH Devanagari Extra" w:cs="BRH Devanagari Extra"/>
+                <w:color w:val="000000"/>
+                <w:sz w:val="40"/>
+                <w:szCs w:val="40"/>
+                <w:lang w:bidi="ml-IN"/>
+              </w:rPr>
+              <w:t>ÍzÉÌiÉ</w:t>
+            </w:r>
+            <w:proofErr w:type="spellEnd"/>
+            <w:r>
+              <w:rPr>
+                <w:rFonts w:ascii="BRH Devanagari Extra" w:hAnsi="BRH Devanagari Extra" w:cs="BRH Devanagari Extra"/>
+                <w:color w:val="000000"/>
+                <w:sz w:val="40"/>
+                <w:szCs w:val="40"/>
+                <w:lang w:bidi="ml-IN"/>
+              </w:rPr>
+              <w:t xml:space="preserve"> - </w:t>
+            </w:r>
+            <w:proofErr w:type="spellStart"/>
+            <w:r>
+              <w:rPr>
+                <w:rFonts w:ascii="BRH Devanagari Extra" w:hAnsi="BRH Devanagari Extra" w:cs="BRH Devanagari Extra"/>
+                <w:color w:val="000000"/>
+                <w:sz w:val="40"/>
+                <w:szCs w:val="40"/>
+                <w:lang w:bidi="ml-IN"/>
+              </w:rPr>
+              <w:t>UlkÉëþÈ</w:t>
+            </w:r>
+            <w:proofErr w:type="spellEnd"/>
+            <w:r>
+              <w:rPr>
+                <w:rFonts w:ascii="BRH Devanagari Extra" w:hAnsi="BRH Devanagari Extra" w:cs="BRH Devanagari Extra"/>
+                <w:color w:val="000000"/>
+                <w:sz w:val="40"/>
+                <w:szCs w:val="40"/>
+                <w:lang w:bidi="ml-IN"/>
+              </w:rPr>
+              <w:t xml:space="preserve"> |</w:t>
             </w:r>
           </w:p>
         </w:tc>
@@ -6570,6 +7867,7 @@
                 <w:lang w:bidi="ml-IN"/>
               </w:rPr>
             </w:pPr>
+            <w:proofErr w:type="spellStart"/>
             <w:r>
               <w:rPr>
                 <w:rFonts w:ascii="BRH Devanagari Extra" w:hAnsi="BRH Devanagari Extra" w:cs="BRH Devanagari Extra"/>
@@ -6600,6 +7898,7 @@
               </w:rPr>
               <w:t>ÌWûþhÉÏ</w:t>
             </w:r>
+            <w:proofErr w:type="spellEnd"/>
             <w:r>
               <w:rPr>
                 <w:rFonts w:ascii="BRH Malayalam Extra" w:hAnsi="BRH Malayalam Extra" w:cs="BRH Devanagari Extra"/>
@@ -6611,15 +7910,27 @@
               </w:rPr>
               <w:t>–</w:t>
             </w:r>
-            <w:r>
-              <w:rPr>
-                <w:rFonts w:ascii="BRH Devanagari Extra" w:hAnsi="BRH Devanagari Extra" w:cs="BRH Devanagari Extra"/>
-                <w:color w:val="000000"/>
-                <w:sz w:val="40"/>
-                <w:szCs w:val="40"/>
-                <w:lang w:bidi="ml-IN"/>
-              </w:rPr>
-              <w:t xml:space="preserve">x§rÉurÉþÈ | </w:t>
+            <w:proofErr w:type="spellStart"/>
+            <w:r>
+              <w:rPr>
+                <w:rFonts w:ascii="BRH Devanagari Extra" w:hAnsi="BRH Devanagari Extra" w:cs="BRH Devanagari Extra"/>
+                <w:color w:val="000000"/>
+                <w:sz w:val="40"/>
+                <w:szCs w:val="40"/>
+                <w:lang w:bidi="ml-IN"/>
+              </w:rPr>
+              <w:t>x§rÉurÉþÈ</w:t>
+            </w:r>
+            <w:proofErr w:type="spellEnd"/>
+            <w:r>
+              <w:rPr>
+                <w:rFonts w:ascii="BRH Devanagari Extra" w:hAnsi="BRH Devanagari Extra" w:cs="BRH Devanagari Extra"/>
+                <w:color w:val="000000"/>
+                <w:sz w:val="40"/>
+                <w:szCs w:val="40"/>
+                <w:lang w:bidi="ml-IN"/>
+              </w:rPr>
+              <w:t xml:space="preserve"> | </w:t>
             </w:r>
             <w:r>
               <w:rPr>
@@ -6630,7 +7941,19 @@
                 <w:highlight w:val="yellow"/>
                 <w:lang w:bidi="ml-IN"/>
               </w:rPr>
-              <w:t>§É</w:t>
+              <w:t>§</w:t>
+            </w:r>
+            <w:proofErr w:type="spellStart"/>
+            <w:r>
+              <w:rPr>
+                <w:rFonts w:ascii="BRH Devanagari Extra" w:hAnsi="BRH Devanagari Extra" w:cs="BRH Devanagari Extra"/>
+                <w:color w:val="000000"/>
+                <w:sz w:val="40"/>
+                <w:szCs w:val="40"/>
+                <w:highlight w:val="yellow"/>
+                <w:lang w:bidi="ml-IN"/>
+              </w:rPr>
+              <w:t>É</w:t>
             </w:r>
             <w:r>
               <w:rPr>
@@ -6642,6 +7965,7 @@
               </w:rPr>
               <w:t>urÉ</w:t>
             </w:r>
+            <w:proofErr w:type="spellEnd"/>
             <w:r>
               <w:rPr>
                 <w:rFonts w:ascii="BRH Malayalam Extra" w:hAnsi="BRH Malayalam Extra" w:cs="BRH Devanagari Extra"/>
@@ -6653,15 +7977,27 @@
               </w:rPr>
               <w:t>–</w:t>
             </w:r>
-            <w:r>
-              <w:rPr>
-                <w:rFonts w:ascii="BRH Devanagari Extra" w:hAnsi="BRH Devanagari Extra" w:cs="BRH Devanagari Extra"/>
-                <w:color w:val="000000"/>
-                <w:sz w:val="40"/>
-                <w:szCs w:val="40"/>
-                <w:lang w:bidi="ml-IN"/>
-              </w:rPr>
-              <w:t xml:space="preserve">xiÉÉÈ | </w:t>
+            <w:proofErr w:type="spellStart"/>
+            <w:r>
+              <w:rPr>
+                <w:rFonts w:ascii="BRH Devanagari Extra" w:hAnsi="BRH Devanagari Extra" w:cs="BRH Devanagari Extra"/>
+                <w:color w:val="000000"/>
+                <w:sz w:val="40"/>
+                <w:szCs w:val="40"/>
+                <w:lang w:bidi="ml-IN"/>
+              </w:rPr>
+              <w:t>xiÉÉÈ</w:t>
+            </w:r>
+            <w:proofErr w:type="spellEnd"/>
+            <w:r>
+              <w:rPr>
+                <w:rFonts w:ascii="BRH Devanagari Extra" w:hAnsi="BRH Devanagari Extra" w:cs="BRH Devanagari Extra"/>
+                <w:color w:val="000000"/>
+                <w:sz w:val="40"/>
+                <w:szCs w:val="40"/>
+                <w:lang w:bidi="ml-IN"/>
+              </w:rPr>
+              <w:t xml:space="preserve"> | </w:t>
             </w:r>
           </w:p>
           <w:p>
@@ -6688,7 +8024,19 @@
                 <w:highlight w:val="yellow"/>
                 <w:lang w:bidi="ml-IN"/>
               </w:rPr>
-              <w:t>§É</w:t>
+              <w:t>§</w:t>
+            </w:r>
+            <w:proofErr w:type="spellStart"/>
+            <w:r>
+              <w:rPr>
+                <w:rFonts w:ascii="BRH Devanagari Extra" w:hAnsi="BRH Devanagari Extra" w:cs="BRH Devanagari Extra"/>
+                <w:color w:val="000000"/>
+                <w:sz w:val="40"/>
+                <w:szCs w:val="40"/>
+                <w:highlight w:val="yellow"/>
+                <w:lang w:bidi="ml-IN"/>
+              </w:rPr>
+              <w:t>É</w:t>
             </w:r>
             <w:r>
               <w:rPr>
@@ -6700,6 +8048,7 @@
               </w:rPr>
               <w:t>urÉ</w:t>
             </w:r>
+            <w:proofErr w:type="spellEnd"/>
             <w:r>
               <w:rPr>
                 <w:rFonts w:ascii="BRH Malayalam Extra" w:hAnsi="BRH Malayalam Extra" w:cs="BRH Devanagari Extra"/>
@@ -6719,7 +8068,51 @@
                 <w:szCs w:val="40"/>
                 <w:lang w:bidi="ml-IN"/>
               </w:rPr>
-              <w:t xml:space="preserve"> CÌiÉþ Ì§É - AurÉþÈ |</w:t>
+              <w:t xml:space="preserve"> </w:t>
+            </w:r>
+            <w:proofErr w:type="spellStart"/>
+            <w:r>
+              <w:rPr>
+                <w:rFonts w:ascii="BRH Devanagari Extra" w:hAnsi="BRH Devanagari Extra" w:cs="BRH Devanagari Extra"/>
+                <w:color w:val="000000"/>
+                <w:sz w:val="40"/>
+                <w:szCs w:val="40"/>
+                <w:lang w:bidi="ml-IN"/>
+              </w:rPr>
+              <w:t>CÌiÉþ</w:t>
+            </w:r>
+            <w:proofErr w:type="spellEnd"/>
+            <w:r>
+              <w:rPr>
+                <w:rFonts w:ascii="BRH Devanagari Extra" w:hAnsi="BRH Devanagari Extra" w:cs="BRH Devanagari Extra"/>
+                <w:color w:val="000000"/>
+                <w:sz w:val="40"/>
+                <w:szCs w:val="40"/>
+                <w:lang w:bidi="ml-IN"/>
+              </w:rPr>
+              <w:t xml:space="preserve"> Ì§É - </w:t>
+            </w:r>
+            <w:proofErr w:type="spellStart"/>
+            <w:r>
+              <w:rPr>
+                <w:rFonts w:ascii="BRH Devanagari Extra" w:hAnsi="BRH Devanagari Extra" w:cs="BRH Devanagari Extra"/>
+                <w:color w:val="000000"/>
+                <w:sz w:val="40"/>
+                <w:szCs w:val="40"/>
+                <w:lang w:bidi="ml-IN"/>
+              </w:rPr>
+              <w:t>AurÉþÈ</w:t>
+            </w:r>
+            <w:proofErr w:type="spellEnd"/>
+            <w:r>
+              <w:rPr>
+                <w:rFonts w:ascii="BRH Devanagari Extra" w:hAnsi="BRH Devanagari Extra" w:cs="BRH Devanagari Extra"/>
+                <w:color w:val="000000"/>
+                <w:sz w:val="40"/>
+                <w:szCs w:val="40"/>
+                <w:lang w:bidi="ml-IN"/>
+              </w:rPr>
+              <w:t xml:space="preserve"> |</w:t>
             </w:r>
           </w:p>
         </w:tc>
@@ -6742,6 +8135,7 @@
                 <w:lang w:bidi="ml-IN"/>
               </w:rPr>
             </w:pPr>
+            <w:proofErr w:type="spellStart"/>
             <w:r>
               <w:rPr>
                 <w:rFonts w:ascii="BRH Devanagari Extra" w:hAnsi="BRH Devanagari Extra" w:cs="BRH Devanagari Extra"/>
@@ -6772,6 +8166,7 @@
               </w:rPr>
               <w:t>ÌWûþhÉÏ</w:t>
             </w:r>
+            <w:proofErr w:type="spellEnd"/>
             <w:r>
               <w:rPr>
                 <w:rFonts w:ascii="BRH Malayalam Extra" w:hAnsi="BRH Malayalam Extra" w:cs="BRH Devanagari Extra"/>
@@ -6783,15 +8178,27 @@
               </w:rPr>
               <w:t>–</w:t>
             </w:r>
-            <w:r>
-              <w:rPr>
-                <w:rFonts w:ascii="BRH Devanagari Extra" w:hAnsi="BRH Devanagari Extra" w:cs="BRH Devanagari Extra"/>
-                <w:color w:val="000000"/>
-                <w:sz w:val="40"/>
-                <w:szCs w:val="40"/>
-                <w:lang w:bidi="ml-IN"/>
-              </w:rPr>
-              <w:t xml:space="preserve">x§rÉurÉþÈ | </w:t>
+            <w:proofErr w:type="spellStart"/>
+            <w:r>
+              <w:rPr>
+                <w:rFonts w:ascii="BRH Devanagari Extra" w:hAnsi="BRH Devanagari Extra" w:cs="BRH Devanagari Extra"/>
+                <w:color w:val="000000"/>
+                <w:sz w:val="40"/>
+                <w:szCs w:val="40"/>
+                <w:lang w:bidi="ml-IN"/>
+              </w:rPr>
+              <w:t>x§rÉurÉþÈ</w:t>
+            </w:r>
+            <w:proofErr w:type="spellEnd"/>
+            <w:r>
+              <w:rPr>
+                <w:rFonts w:ascii="BRH Devanagari Extra" w:hAnsi="BRH Devanagari Extra" w:cs="BRH Devanagari Extra"/>
+                <w:color w:val="000000"/>
+                <w:sz w:val="40"/>
+                <w:szCs w:val="40"/>
+                <w:lang w:bidi="ml-IN"/>
+              </w:rPr>
+              <w:t xml:space="preserve"> | </w:t>
             </w:r>
             <w:r>
               <w:rPr>
@@ -6801,7 +8208,18 @@
                 <w:szCs w:val="40"/>
                 <w:highlight w:val="green"/>
               </w:rPr>
-              <w:t>§ÉçrÉ</w:t>
+              <w:t>§</w:t>
+            </w:r>
+            <w:proofErr w:type="spellStart"/>
+            <w:r>
+              <w:rPr>
+                <w:rFonts w:ascii="BRH Devanagari" w:hAnsi="BRH Devanagari" w:cs="BRH Devanagari"/>
+                <w:color w:val="000000"/>
+                <w:sz w:val="40"/>
+                <w:szCs w:val="40"/>
+                <w:highlight w:val="green"/>
+              </w:rPr>
+              <w:t>ÉçrÉ</w:t>
             </w:r>
             <w:r>
               <w:rPr>
@@ -6813,6 +8231,7 @@
               </w:rPr>
               <w:t>urÉ</w:t>
             </w:r>
+            <w:proofErr w:type="spellEnd"/>
             <w:r>
               <w:rPr>
                 <w:rFonts w:ascii="BRH Malayalam Extra" w:hAnsi="BRH Malayalam Extra" w:cs="BRH Devanagari Extra"/>
@@ -6824,15 +8243,27 @@
               </w:rPr>
               <w:t>–</w:t>
             </w:r>
-            <w:r>
-              <w:rPr>
-                <w:rFonts w:ascii="BRH Devanagari Extra" w:hAnsi="BRH Devanagari Extra" w:cs="BRH Devanagari Extra"/>
-                <w:color w:val="000000"/>
-                <w:sz w:val="40"/>
-                <w:szCs w:val="40"/>
-                <w:lang w:bidi="ml-IN"/>
-              </w:rPr>
-              <w:t xml:space="preserve">xiÉÉÈ | </w:t>
+            <w:proofErr w:type="spellStart"/>
+            <w:r>
+              <w:rPr>
+                <w:rFonts w:ascii="BRH Devanagari Extra" w:hAnsi="BRH Devanagari Extra" w:cs="BRH Devanagari Extra"/>
+                <w:color w:val="000000"/>
+                <w:sz w:val="40"/>
+                <w:szCs w:val="40"/>
+                <w:lang w:bidi="ml-IN"/>
+              </w:rPr>
+              <w:t>xiÉÉÈ</w:t>
+            </w:r>
+            <w:proofErr w:type="spellEnd"/>
+            <w:r>
+              <w:rPr>
+                <w:rFonts w:ascii="BRH Devanagari Extra" w:hAnsi="BRH Devanagari Extra" w:cs="BRH Devanagari Extra"/>
+                <w:color w:val="000000"/>
+                <w:sz w:val="40"/>
+                <w:szCs w:val="40"/>
+                <w:lang w:bidi="ml-IN"/>
+              </w:rPr>
+              <w:t xml:space="preserve"> | </w:t>
             </w:r>
           </w:p>
           <w:p>
@@ -6858,14 +8289,25 @@
                 <w:szCs w:val="40"/>
                 <w:highlight w:val="green"/>
               </w:rPr>
-              <w:t>§Éçr</w:t>
-            </w:r>
+              <w:t>§</w:t>
+            </w:r>
+            <w:proofErr w:type="spellStart"/>
             <w:r>
               <w:rPr>
                 <w:rFonts w:ascii="BRH Devanagari" w:hAnsi="BRH Devanagari" w:cs="BRH Devanagari"/>
                 <w:color w:val="000000"/>
                 <w:sz w:val="40"/>
                 <w:szCs w:val="40"/>
+                <w:highlight w:val="green"/>
+              </w:rPr>
+              <w:t>Éçr</w:t>
+            </w:r>
+            <w:r>
+              <w:rPr>
+                <w:rFonts w:ascii="BRH Devanagari" w:hAnsi="BRH Devanagari" w:cs="BRH Devanagari"/>
+                <w:color w:val="000000"/>
+                <w:sz w:val="40"/>
+                <w:szCs w:val="40"/>
               </w:rPr>
               <w:t>É</w:t>
             </w:r>
@@ -6879,6 +8321,7 @@
               </w:rPr>
               <w:t>urÉ</w:t>
             </w:r>
+            <w:proofErr w:type="spellEnd"/>
             <w:r>
               <w:rPr>
                 <w:rFonts w:ascii="BRH Malayalam Extra" w:hAnsi="BRH Malayalam Extra" w:cs="BRH Devanagari Extra"/>
@@ -6898,7 +8341,51 @@
                 <w:szCs w:val="40"/>
                 <w:lang w:bidi="ml-IN"/>
               </w:rPr>
-              <w:t xml:space="preserve"> CÌiÉþ Ì§É - AurÉþÈ |</w:t>
+              <w:t xml:space="preserve"> </w:t>
+            </w:r>
+            <w:proofErr w:type="spellStart"/>
+            <w:r>
+              <w:rPr>
+                <w:rFonts w:ascii="BRH Devanagari Extra" w:hAnsi="BRH Devanagari Extra" w:cs="BRH Devanagari Extra"/>
+                <w:color w:val="000000"/>
+                <w:sz w:val="40"/>
+                <w:szCs w:val="40"/>
+                <w:lang w:bidi="ml-IN"/>
+              </w:rPr>
+              <w:t>CÌiÉþ</w:t>
+            </w:r>
+            <w:proofErr w:type="spellEnd"/>
+            <w:r>
+              <w:rPr>
+                <w:rFonts w:ascii="BRH Devanagari Extra" w:hAnsi="BRH Devanagari Extra" w:cs="BRH Devanagari Extra"/>
+                <w:color w:val="000000"/>
+                <w:sz w:val="40"/>
+                <w:szCs w:val="40"/>
+                <w:lang w:bidi="ml-IN"/>
+              </w:rPr>
+              <w:t xml:space="preserve"> Ì§É - </w:t>
+            </w:r>
+            <w:proofErr w:type="spellStart"/>
+            <w:r>
+              <w:rPr>
+                <w:rFonts w:ascii="BRH Devanagari Extra" w:hAnsi="BRH Devanagari Extra" w:cs="BRH Devanagari Extra"/>
+                <w:color w:val="000000"/>
+                <w:sz w:val="40"/>
+                <w:szCs w:val="40"/>
+                <w:lang w:bidi="ml-IN"/>
+              </w:rPr>
+              <w:t>AurÉþÈ</w:t>
+            </w:r>
+            <w:proofErr w:type="spellEnd"/>
+            <w:r>
+              <w:rPr>
+                <w:rFonts w:ascii="BRH Devanagari Extra" w:hAnsi="BRH Devanagari Extra" w:cs="BRH Devanagari Extra"/>
+                <w:color w:val="000000"/>
+                <w:sz w:val="40"/>
+                <w:szCs w:val="40"/>
+                <w:lang w:bidi="ml-IN"/>
+              </w:rPr>
+              <w:t xml:space="preserve"> |</w:t>
             </w:r>
             <w:r>
               <w:rPr>
@@ -6934,6 +8421,7 @@
               </w:rPr>
               <w:t>“</w:t>
             </w:r>
+            <w:proofErr w:type="spellStart"/>
             <w:r>
               <w:rPr>
                 <w:b/>
@@ -6946,7 +8434,15 @@
                 <w:b/>
                 <w:bCs/>
               </w:rPr>
-              <w:t>a”</w:t>
+              <w:t>a</w:t>
+            </w:r>
+            <w:proofErr w:type="spellEnd"/>
+            <w:r>
+              <w:rPr>
+                <w:b/>
+                <w:bCs/>
+              </w:rPr>
+              <w:t>”</w:t>
             </w:r>
             <w:r>
               <w:rPr>
@@ -7108,6 +8604,7 @@
               </w:rPr>
               <w:t>–</w:t>
             </w:r>
+            <w:proofErr w:type="spellStart"/>
             <w:r>
               <w:rPr>
                 <w:rFonts w:ascii="BRH Devanagari Extra" w:hAnsi="BRH Devanagari Extra" w:cs="BRH Devanagari Extra"/>
@@ -7118,6 +8615,7 @@
               </w:rPr>
               <w:t>lSìÉ</w:t>
             </w:r>
+            <w:proofErr w:type="spellEnd"/>
             <w:r>
               <w:rPr>
                 <w:rFonts w:ascii="BRH Malayalam Extra" w:hAnsi="BRH Malayalam Extra" w:cs="BRH Devanagari Extra"/>
@@ -7129,6 +8627,7 @@
               </w:rPr>
               <w:t>–</w:t>
             </w:r>
+            <w:proofErr w:type="spellStart"/>
             <w:r>
               <w:rPr>
                 <w:rFonts w:ascii="BRH Devanagari Extra" w:hAnsi="BRH Devanagari Extra" w:cs="BRH Devanagari Extra"/>
@@ -7139,6 +8638,7 @@
               </w:rPr>
               <w:t>uÉæ</w:t>
             </w:r>
+            <w:proofErr w:type="spellEnd"/>
             <w:r>
               <w:rPr>
                 <w:rFonts w:ascii="BRH Malayalam Extra" w:hAnsi="BRH Malayalam Extra" w:cs="BRH Devanagari Extra"/>
@@ -7150,6 +8650,7 @@
               </w:rPr>
               <w:t>–</w:t>
             </w:r>
+            <w:proofErr w:type="spellStart"/>
             <w:r>
               <w:rPr>
                 <w:rFonts w:ascii="BRH Devanagari Extra" w:hAnsi="BRH Devanagari Extra" w:cs="BRH Devanagari Extra"/>
@@ -7160,6 +8661,7 @@
               </w:rPr>
               <w:t>whÉ</w:t>
             </w:r>
+            <w:proofErr w:type="spellEnd"/>
             <w:r>
               <w:rPr>
                 <w:rFonts w:ascii="BRH Malayalam Extra" w:hAnsi="BRH Malayalam Extra" w:cs="BRH Devanagari Extra"/>
@@ -7171,15 +8673,38 @@
               </w:rPr>
               <w:t>–</w:t>
             </w:r>
-            <w:r>
-              <w:rPr>
-                <w:rFonts w:ascii="BRH Devanagari Extra" w:hAnsi="BRH Devanagari Extra" w:cs="BRH Devanagari Extra"/>
-                <w:color w:val="000000"/>
-                <w:sz w:val="40"/>
-                <w:szCs w:val="40"/>
-                <w:lang w:bidi="ml-IN"/>
-              </w:rPr>
-              <w:t>uÉÉ C</w:t>
+            <w:proofErr w:type="spellStart"/>
+            <w:r>
+              <w:rPr>
+                <w:rFonts w:ascii="BRH Devanagari Extra" w:hAnsi="BRH Devanagari Extra" w:cs="BRH Devanagari Extra"/>
+                <w:color w:val="000000"/>
+                <w:sz w:val="40"/>
+                <w:szCs w:val="40"/>
+                <w:lang w:bidi="ml-IN"/>
+              </w:rPr>
+              <w:t>uÉÉ</w:t>
+            </w:r>
+            <w:proofErr w:type="spellEnd"/>
+            <w:r>
+              <w:rPr>
+                <w:rFonts w:ascii="BRH Devanagari Extra" w:hAnsi="BRH Devanagari Extra" w:cs="BRH Devanagari Extra"/>
+                <w:color w:val="000000"/>
+                <w:sz w:val="40"/>
+                <w:szCs w:val="40"/>
+                <w:lang w:bidi="ml-IN"/>
+              </w:rPr>
+              <w:t xml:space="preserve"> </w:t>
+            </w:r>
+            <w:proofErr w:type="spellStart"/>
+            <w:r>
+              <w:rPr>
+                <w:rFonts w:ascii="BRH Devanagari Extra" w:hAnsi="BRH Devanagari Extra" w:cs="BRH Devanagari Extra"/>
+                <w:color w:val="000000"/>
+                <w:sz w:val="40"/>
+                <w:szCs w:val="40"/>
+                <w:lang w:bidi="ml-IN"/>
+              </w:rPr>
+              <w:t>C</w:t>
             </w:r>
             <w:r>
               <w:rPr>
@@ -7200,8 +8725,31 @@
                 <w:szCs w:val="40"/>
                 <w:lang w:bidi="ml-IN"/>
               </w:rPr>
-              <w:t>æÿlSìÉ - uÉæ</w:t>
-            </w:r>
+              <w:t>æÿlSìÉ</w:t>
+            </w:r>
+            <w:proofErr w:type="spellEnd"/>
+            <w:r>
+              <w:rPr>
+                <w:rFonts w:ascii="BRH Devanagari Extra" w:hAnsi="BRH Devanagari Extra" w:cs="BRH Devanagari Extra"/>
+                <w:color w:val="000000"/>
+                <w:sz w:val="40"/>
+                <w:szCs w:val="40"/>
+                <w:lang w:bidi="ml-IN"/>
+              </w:rPr>
+              <w:t xml:space="preserve"> - </w:t>
+            </w:r>
+            <w:proofErr w:type="spellStart"/>
+            <w:r>
+              <w:rPr>
+                <w:rFonts w:ascii="BRH Devanagari Extra" w:hAnsi="BRH Devanagari Extra" w:cs="BRH Devanagari Extra"/>
+                <w:color w:val="000000"/>
+                <w:sz w:val="40"/>
+                <w:szCs w:val="40"/>
+                <w:lang w:bidi="ml-IN"/>
+              </w:rPr>
+              <w:t>uÉæ</w:t>
+            </w:r>
+            <w:proofErr w:type="spellEnd"/>
             <w:r>
               <w:rPr>
                 <w:rFonts w:ascii="BRH Malayalam Extra" w:hAnsi="BRH Malayalam Extra" w:cs="BRH Devanagari Extra"/>
@@ -7213,6 +8761,7 @@
               </w:rPr>
               <w:t>–</w:t>
             </w:r>
+            <w:proofErr w:type="spellStart"/>
             <w:r>
               <w:rPr>
                 <w:rFonts w:ascii="BRH Devanagari Extra" w:hAnsi="BRH Devanagari Extra" w:cs="BRH Devanagari Extra"/>
@@ -7223,6 +8772,7 @@
               </w:rPr>
               <w:t>whÉ</w:t>
             </w:r>
+            <w:proofErr w:type="spellEnd"/>
             <w:r>
               <w:rPr>
                 <w:rFonts w:ascii="BRH Malayalam Extra" w:hAnsi="BRH Malayalam Extra" w:cs="BRH Devanagari Extra"/>
@@ -7234,15 +8784,27 @@
               </w:rPr>
               <w:t>–</w:t>
             </w:r>
-            <w:r>
-              <w:rPr>
-                <w:rFonts w:ascii="BRH Devanagari Extra" w:hAnsi="BRH Devanagari Extra" w:cs="BRH Devanagari Extra"/>
-                <w:color w:val="000000"/>
-                <w:sz w:val="40"/>
-                <w:szCs w:val="40"/>
-                <w:lang w:bidi="ml-IN"/>
-              </w:rPr>
-              <w:t>uÉÉÈ |</w:t>
+            <w:proofErr w:type="spellStart"/>
+            <w:r>
+              <w:rPr>
+                <w:rFonts w:ascii="BRH Devanagari Extra" w:hAnsi="BRH Devanagari Extra" w:cs="BRH Devanagari Extra"/>
+                <w:color w:val="000000"/>
+                <w:sz w:val="40"/>
+                <w:szCs w:val="40"/>
+                <w:lang w:bidi="ml-IN"/>
+              </w:rPr>
+              <w:t>uÉÉÈ</w:t>
+            </w:r>
+            <w:proofErr w:type="spellEnd"/>
+            <w:r>
+              <w:rPr>
+                <w:rFonts w:ascii="BRH Devanagari Extra" w:hAnsi="BRH Devanagari Extra" w:cs="BRH Devanagari Extra"/>
+                <w:color w:val="000000"/>
+                <w:sz w:val="40"/>
+                <w:szCs w:val="40"/>
+                <w:lang w:bidi="ml-IN"/>
+              </w:rPr>
+              <w:t xml:space="preserve"> |</w:t>
             </w:r>
           </w:p>
         </w:tc>
@@ -7286,6 +8848,7 @@
               </w:rPr>
               <w:t>–</w:t>
             </w:r>
+            <w:proofErr w:type="spellStart"/>
             <w:r>
               <w:rPr>
                 <w:rFonts w:ascii="BRH Devanagari Extra" w:hAnsi="BRH Devanagari Extra" w:cs="BRH Devanagari Extra"/>
@@ -7296,6 +8859,7 @@
               </w:rPr>
               <w:t>lSìÉ</w:t>
             </w:r>
+            <w:proofErr w:type="spellEnd"/>
             <w:r>
               <w:rPr>
                 <w:rFonts w:ascii="BRH Malayalam Extra" w:hAnsi="BRH Malayalam Extra" w:cs="BRH Devanagari Extra"/>
@@ -7307,6 +8871,7 @@
               </w:rPr>
               <w:t>–</w:t>
             </w:r>
+            <w:proofErr w:type="spellStart"/>
             <w:r>
               <w:rPr>
                 <w:rFonts w:ascii="BRH Devanagari Extra" w:hAnsi="BRH Devanagari Extra" w:cs="BRH Devanagari Extra"/>
@@ -7317,6 +8882,7 @@
               </w:rPr>
               <w:t>uÉæ</w:t>
             </w:r>
+            <w:proofErr w:type="spellEnd"/>
             <w:r>
               <w:rPr>
                 <w:rFonts w:ascii="BRH Malayalam Extra" w:hAnsi="BRH Malayalam Extra" w:cs="BRH Devanagari Extra"/>
@@ -7328,6 +8894,7 @@
               </w:rPr>
               <w:t>–</w:t>
             </w:r>
+            <w:proofErr w:type="spellStart"/>
             <w:r>
               <w:rPr>
                 <w:rFonts w:ascii="BRH Devanagari Extra" w:hAnsi="BRH Devanagari Extra" w:cs="BRH Devanagari Extra"/>
@@ -7338,6 +8905,7 @@
               </w:rPr>
               <w:t>whÉ</w:t>
             </w:r>
+            <w:proofErr w:type="spellEnd"/>
             <w:r>
               <w:rPr>
                 <w:rFonts w:ascii="BRH Malayalam Extra" w:hAnsi="BRH Malayalam Extra" w:cs="BRH Devanagari Extra"/>
@@ -7349,15 +8917,38 @@
               </w:rPr>
               <w:t>–</w:t>
             </w:r>
-            <w:r>
-              <w:rPr>
-                <w:rFonts w:ascii="BRH Devanagari Extra" w:hAnsi="BRH Devanagari Extra" w:cs="BRH Devanagari Extra"/>
-                <w:color w:val="000000"/>
-                <w:sz w:val="40"/>
-                <w:szCs w:val="40"/>
-                <w:lang w:bidi="ml-IN"/>
-              </w:rPr>
-              <w:t>uÉÉ C</w:t>
+            <w:proofErr w:type="spellStart"/>
+            <w:r>
+              <w:rPr>
+                <w:rFonts w:ascii="BRH Devanagari Extra" w:hAnsi="BRH Devanagari Extra" w:cs="BRH Devanagari Extra"/>
+                <w:color w:val="000000"/>
+                <w:sz w:val="40"/>
+                <w:szCs w:val="40"/>
+                <w:lang w:bidi="ml-IN"/>
+              </w:rPr>
+              <w:t>uÉÉ</w:t>
+            </w:r>
+            <w:proofErr w:type="spellEnd"/>
+            <w:r>
+              <w:rPr>
+                <w:rFonts w:ascii="BRH Devanagari Extra" w:hAnsi="BRH Devanagari Extra" w:cs="BRH Devanagari Extra"/>
+                <w:color w:val="000000"/>
+                <w:sz w:val="40"/>
+                <w:szCs w:val="40"/>
+                <w:lang w:bidi="ml-IN"/>
+              </w:rPr>
+              <w:t xml:space="preserve"> </w:t>
+            </w:r>
+            <w:proofErr w:type="spellStart"/>
+            <w:r>
+              <w:rPr>
+                <w:rFonts w:ascii="BRH Devanagari Extra" w:hAnsi="BRH Devanagari Extra" w:cs="BRH Devanagari Extra"/>
+                <w:color w:val="000000"/>
+                <w:sz w:val="40"/>
+                <w:szCs w:val="40"/>
+                <w:lang w:bidi="ml-IN"/>
+              </w:rPr>
+              <w:t>C</w:t>
             </w:r>
             <w:r>
               <w:rPr>
@@ -7378,8 +8969,31 @@
                 <w:szCs w:val="40"/>
                 <w:lang w:bidi="ml-IN"/>
               </w:rPr>
-              <w:t>æÿlSìÉ - uÉæ</w:t>
-            </w:r>
+              <w:t>æÿlSìÉ</w:t>
+            </w:r>
+            <w:proofErr w:type="spellEnd"/>
+            <w:r>
+              <w:rPr>
+                <w:rFonts w:ascii="BRH Devanagari Extra" w:hAnsi="BRH Devanagari Extra" w:cs="BRH Devanagari Extra"/>
+                <w:color w:val="000000"/>
+                <w:sz w:val="40"/>
+                <w:szCs w:val="40"/>
+                <w:lang w:bidi="ml-IN"/>
+              </w:rPr>
+              <w:t xml:space="preserve"> - </w:t>
+            </w:r>
+            <w:proofErr w:type="spellStart"/>
+            <w:r>
+              <w:rPr>
+                <w:rFonts w:ascii="BRH Devanagari Extra" w:hAnsi="BRH Devanagari Extra" w:cs="BRH Devanagari Extra"/>
+                <w:color w:val="000000"/>
+                <w:sz w:val="40"/>
+                <w:szCs w:val="40"/>
+                <w:lang w:bidi="ml-IN"/>
+              </w:rPr>
+              <w:t>uÉæ</w:t>
+            </w:r>
+            <w:proofErr w:type="spellEnd"/>
             <w:r>
               <w:rPr>
                 <w:rFonts w:ascii="BRH Malayalam Extra" w:hAnsi="BRH Malayalam Extra" w:cs="BRH Devanagari Extra"/>
@@ -7391,6 +9005,7 @@
               </w:rPr>
               <w:t>–</w:t>
             </w:r>
+            <w:proofErr w:type="spellStart"/>
             <w:r>
               <w:rPr>
                 <w:rFonts w:ascii="BRH Devanagari Extra" w:hAnsi="BRH Devanagari Extra" w:cs="BRH Devanagari Extra"/>
@@ -7401,6 +9016,7 @@
               </w:rPr>
               <w:t>whÉ</w:t>
             </w:r>
+            <w:proofErr w:type="spellEnd"/>
             <w:r>
               <w:rPr>
                 <w:rFonts w:ascii="BRH Malayalam Extra" w:hAnsi="BRH Malayalam Extra" w:cs="BRH Devanagari Extra"/>
@@ -7412,15 +9028,27 @@
               </w:rPr>
               <w:t>–</w:t>
             </w:r>
-            <w:r>
-              <w:rPr>
-                <w:rFonts w:ascii="BRH Devanagari Extra" w:hAnsi="BRH Devanagari Extra" w:cs="BRH Devanagari Extra"/>
-                <w:color w:val="000000"/>
-                <w:sz w:val="40"/>
-                <w:szCs w:val="40"/>
-                <w:lang w:bidi="ml-IN"/>
-              </w:rPr>
-              <w:t>uÉÉÈ |</w:t>
+            <w:proofErr w:type="spellStart"/>
+            <w:r>
+              <w:rPr>
+                <w:rFonts w:ascii="BRH Devanagari Extra" w:hAnsi="BRH Devanagari Extra" w:cs="BRH Devanagari Extra"/>
+                <w:color w:val="000000"/>
+                <w:sz w:val="40"/>
+                <w:szCs w:val="40"/>
+                <w:lang w:bidi="ml-IN"/>
+              </w:rPr>
+              <w:t>uÉÉÈ</w:t>
+            </w:r>
+            <w:proofErr w:type="spellEnd"/>
+            <w:r>
+              <w:rPr>
+                <w:rFonts w:ascii="BRH Devanagari Extra" w:hAnsi="BRH Devanagari Extra" w:cs="BRH Devanagari Extra"/>
+                <w:color w:val="000000"/>
+                <w:sz w:val="40"/>
+                <w:szCs w:val="40"/>
+                <w:lang w:bidi="ml-IN"/>
+              </w:rPr>
+              <w:t xml:space="preserve"> |</w:t>
             </w:r>
           </w:p>
         </w:tc>
@@ -7454,7 +9082,29 @@
           <w:szCs w:val="40"/>
           <w:lang w:val="en-IN" w:eastAsia="en-IN"/>
         </w:rPr>
-        <w:t xml:space="preserve">"zlÉ" </w:t>
+        <w:t>"</w:t>
+      </w:r>
+      <w:proofErr w:type="spellStart"/>
+      <w:r>
+        <w:rPr>
+          <w:rFonts w:ascii="BRH Devanagari" w:hAnsi="BRH Devanagari" w:cs="BRH Devanagari"/>
+          <w:color w:val="000000"/>
+          <w:sz w:val="40"/>
+          <w:szCs w:val="40"/>
+          <w:lang w:val="en-IN" w:eastAsia="en-IN"/>
+        </w:rPr>
+        <w:t>zlÉ</w:t>
+      </w:r>
+      <w:proofErr w:type="spellEnd"/>
+      <w:r>
+        <w:rPr>
+          <w:rFonts w:ascii="BRH Devanagari" w:hAnsi="BRH Devanagari" w:cs="BRH Devanagari"/>
+          <w:color w:val="000000"/>
+          <w:sz w:val="40"/>
+          <w:szCs w:val="40"/>
+          <w:lang w:val="en-IN" w:eastAsia="en-IN"/>
+        </w:rPr>
+        <w:t xml:space="preserve">" </w:t>
       </w:r>
       <w:r>
         <w:rPr>
@@ -7493,6 +9143,7 @@
         </w:rPr>
         <w:t>"</w:t>
       </w:r>
+      <w:proofErr w:type="spellStart"/>
       <w:proofErr w:type="gramEnd"/>
       <w:r>
         <w:rPr>
@@ -7505,6 +9156,7 @@
         </w:rPr>
         <w:t>zgÉ</w:t>
       </w:r>
+      <w:proofErr w:type="spellEnd"/>
       <w:r>
         <w:rPr>
           <w:rFonts w:ascii="BRH Devanagari" w:hAnsi="BRH Devanagari" w:cs="BRH Devanagari"/>
@@ -8016,14 +9668,21 @@
         <w:bCs/>
       </w:rPr>
       <w:tab/>
-      <w:t xml:space="preserve">              v</w:t>
+      <w:t xml:space="preserve">              </w:t>
     </w:r>
     <w:r>
       <w:rPr>
         <w:b/>
         <w:bCs/>
       </w:rPr>
-      <w:t>edavms@gmail.com</w:t>
+      <w:t>www.vedavms.in</w:t>
+    </w:r>
+    <w:r>
+      <w:rPr>
+        <w:b/>
+        <w:bCs/>
+      </w:rPr>
+      <w:t xml:space="preserve">   </w:t>
     </w:r>
     <w:r>
       <w:rPr>
@@ -8902,6 +10561,29 @@
       <w:lang w:bidi="ar-SA"/>
     </w:rPr>
   </w:style>
+  <w:style w:type="character" w:styleId="Hyperlink">
+    <w:name w:val="Hyperlink"/>
+    <w:basedOn w:val="DefaultParagraphFont"/>
+    <w:uiPriority w:val="99"/>
+    <w:unhideWhenUsed/>
+    <w:rsid w:val="00A43D9C"/>
+    <w:rPr>
+      <w:color w:val="0563C1" w:themeColor="hyperlink"/>
+      <w:u w:val="single"/>
+    </w:rPr>
+  </w:style>
+  <w:style w:type="character" w:styleId="UnresolvedMention">
+    <w:name w:val="Unresolved Mention"/>
+    <w:basedOn w:val="DefaultParagraphFont"/>
+    <w:uiPriority w:val="99"/>
+    <w:semiHidden/>
+    <w:unhideWhenUsed/>
+    <w:rsid w:val="00A43D9C"/>
+    <w:rPr>
+      <w:color w:val="605E5C"/>
+      <w:shd w:val="clear" w:color="auto" w:fill="E1DFDD"/>
+    </w:rPr>
+  </w:style>
 </w:styles>
 </file>
 

</xml_diff>